<commit_message>
R1-T01: canonical schema + migration framework (record_id, schema_version.json, scripts/migrations/, scripts/validate_data.py, docs/data_dictionary.md); also fixes PDF-conversion overwrite failure in build_dashboard.py
</commit_message>
<xml_diff>
--- a/reports/Orbit2_Report_Atlassian_2026-Q3.docx
+++ b/reports/Orbit2_Report_Atlassian_2026-Q3.docx
@@ -20,7 +20,7 @@
           <w:sz w:val="18"/>
           <w:szCs w:val="18"/>
         </w:rPr>
-        <w:t xml:space="preserve">Generated 2026-07-06 · Prepared for Steve Mojsak, Atlassian Alliance Manager, Communardo</w:t>
+        <w:t xml:space="preserve">Generated 2026-07-16 · Prepared for Steve Mojsak, Atlassian Alliance Manager, Communardo</w:t>
       </w:r>
     </w:p>
     <w:p>
@@ -3575,7 +3575,7 @@
                 <w:sz w:val="17"/>
                 <w:szCs w:val="17"/>
               </w:rPr>
-              <w:t xml:space="preserve"> by design</w:t>
+              <w:t xml:space="preserve">Count of public mentions of Communardo found by the automated web scan — the only metric in this scorecard driven entirely by live, automated data rather than manual entry.</w:t>
             </w:r>
           </w:p>
         </w:tc>
@@ -8558,7 +8558,7 @@
                 <w:sz w:val="18"/>
                 <w:szCs w:val="18"/>
               </w:rPr>
-              <w:t xml:space="preserve">Coverage of Communardo's growth as Atlassian Platinum Solution Partner and Marketplace vendor.</w:t>
+              <w:t xml:space="preserve"/>
             </w:r>
           </w:p>
         </w:tc>
@@ -8664,7 +8664,7 @@
                 <w:sz w:val="18"/>
                 <w:szCs w:val="18"/>
               </w:rPr>
-              <w:t xml:space="preserve">Acquisition of Dutch Atlassian Platinum partner Prepend, expanding Communardo's European footprint.</w:t>
+              <w:t xml:space="preserve"/>
             </w:r>
           </w:p>
         </w:tc>
@@ -9516,7 +9516,7 @@
                 <w:sz w:val="18"/>
                 <w:szCs w:val="18"/>
               </w:rPr>
-              <w:t xml:space="preserve"> by design</w:t>
+              <w:t xml:space="preserve">Count of public mentions of Communardo found by the automated web scan — the only metric in this scorecard driven entirely by live, automated data rather than manual entry.</w:t>
             </w:r>
           </w:p>
         </w:tc>

</xml_diff>

<commit_message>
R1-T08: Objectives and progress tracking — connects daily activity to quarterly/annual role objectives (manual/count-linked/sum-linked-value progress, overachievement never hidden, at-risk + recovery workflow, objective review export)
</commit_message>
<xml_diff>
--- a/reports/Orbit2_Report_Atlassian_2026-Q3.docx
+++ b/reports/Orbit2_Report_Atlassian_2026-Q3.docx
@@ -20,7 +20,7 @@
           <w:sz w:val="18"/>
           <w:szCs w:val="18"/>
         </w:rPr>
-        <w:t xml:space="preserve">Generated 2026-07-16 · Prepared for Steve Mojsak, Atlassian Alliance Manager, Communardo</w:t>
+        <w:t xml:space="preserve">Generated 2026-07-18 · Prepared for Steve Mojsak, Atlassian Alliance Manager, Communardo</w:t>
       </w:r>
     </w:p>
     <w:p>
@@ -8314,7 +8314,7 @@
           <w:sz w:val="20"/>
           <w:szCs w:val="20"/>
         </w:rPr>
-        <w:t xml:space="preserve">Logged mentions: 2 total — 2 positive, 0 neutral, 0 negative.</w:t>
+        <w:t xml:space="preserve">Logged mentions: 15 total — 15 positive, 0 neutral, 0 negative.</w:t>
       </w:r>
     </w:p>
     <w:tbl>
@@ -8480,7 +8480,7 @@
                 <w:sz w:val="18"/>
                 <w:szCs w:val="18"/>
               </w:rPr>
-              <w:t xml:space="preserve">2026-06-15</w:t>
+              <w:t xml:space="preserve">2026-07-18</w:t>
             </w:r>
           </w:p>
         </w:tc>
@@ -8532,7 +8532,7 @@
                 <w:sz w:val="18"/>
                 <w:szCs w:val="18"/>
               </w:rPr>
-              <w:t xml:space="preserve">Communardo scales as an Atlassian &amp; Microsoft platform across Europe</w:t>
+              <w:t xml:space="preserve">Communardo Products rebrands as Elevatic unifying Marketplace app portfolio</w:t>
             </w:r>
           </w:p>
         </w:tc>
@@ -8558,7 +8558,7 @@
                 <w:sz w:val="18"/>
                 <w:szCs w:val="18"/>
               </w:rPr>
-              <w:t xml:space="preserve"/>
+              <w:t xml:space="preserve">Communardo Products rebranded as Elevatic, consolidating the former Communardo Products, bitvoodoo, and Mibex brands into one independent Atlassian Marketplace vendor.</w:t>
             </w:r>
           </w:p>
         </w:tc>
@@ -8586,7 +8586,7 @@
                 <w:sz w:val="18"/>
                 <w:szCs w:val="18"/>
               </w:rPr>
-              <w:t xml:space="preserve">2026-06-28</w:t>
+              <w:t xml:space="preserve">2026-07-18</w:t>
             </w:r>
           </w:p>
         </w:tc>
@@ -8638,7 +8638,7 @@
                 <w:sz w:val="18"/>
                 <w:szCs w:val="18"/>
               </w:rPr>
-              <w:t xml:space="preserve">Communardo strengthens European presence with expansion into the Benelux region</w:t>
+              <w:t xml:space="preserve">Anje Hickey appointed CEO for Atlassian Professional Services in Europe</w:t>
             </w:r>
           </w:p>
         </w:tc>
@@ -8664,7 +8664,855 @@
                 <w:sz w:val="18"/>
                 <w:szCs w:val="18"/>
               </w:rPr>
-              <w:t xml:space="preserve"/>
+              <w:t xml:space="preserve">Communardo named Anje Hickey, former CEO of Fellowmind Germany and 12-year Microsoft veteran, as CEO of its Atlassian Professional Services business across Europe effective January 1, 2026.</w:t>
+            </w:r>
+          </w:p>
+        </w:tc>
+      </w:tr>
+      <w:tr>
+        <w:tc>
+          <w:tcPr>
+            <w:tcW w:type="dxa" w:w="1500"/>
+            <w:tcBorders>
+              <w:top w:val="single" w:color="CCCCCC" w:sz="1"/>
+              <w:left w:val="single" w:color="CCCCCC" w:sz="1"/>
+              <w:bottom w:val="single" w:color="CCCCCC" w:sz="1"/>
+              <w:right w:val="single" w:color="CCCCCC" w:sz="1"/>
+            </w:tcBorders>
+            <w:tcMar>
+              <w:top w:type="dxa" w:w="80"/>
+              <w:left w:type="dxa" w:w="120"/>
+              <w:bottom w:type="dxa" w:w="80"/>
+              <w:right w:type="dxa" w:w="120"/>
+            </w:tcMar>
+          </w:tcPr>
+          <w:p>
+            <w:r>
+              <w:rPr>
+                <w:sz w:val="18"/>
+                <w:szCs w:val="18"/>
+              </w:rPr>
+              <w:t xml:space="preserve">2026-07-18</w:t>
+            </w:r>
+          </w:p>
+        </w:tc>
+        <w:tc>
+          <w:tcPr>
+            <w:tcW w:type="dxa" w:w="1300"/>
+            <w:tcBorders>
+              <w:top w:val="single" w:color="CCCCCC" w:sz="1"/>
+              <w:left w:val="single" w:color="CCCCCC" w:sz="1"/>
+              <w:bottom w:val="single" w:color="CCCCCC" w:sz="1"/>
+              <w:right w:val="single" w:color="CCCCCC" w:sz="1"/>
+            </w:tcBorders>
+            <w:tcMar>
+              <w:top w:type="dxa" w:w="80"/>
+              <w:left w:type="dxa" w:w="120"/>
+              <w:bottom w:type="dxa" w:w="80"/>
+              <w:right w:type="dxa" w:w="120"/>
+            </w:tcMar>
+          </w:tcPr>
+          <w:p>
+            <w:r>
+              <w:rPr>
+                <w:sz w:val="18"/>
+                <w:szCs w:val="18"/>
+              </w:rPr>
+              <w:t xml:space="preserve">positive</w:t>
+            </w:r>
+          </w:p>
+        </w:tc>
+        <w:tc>
+          <w:tcPr>
+            <w:tcW w:type="dxa" w:w="4200"/>
+            <w:tcBorders>
+              <w:top w:val="single" w:color="CCCCCC" w:sz="1"/>
+              <w:left w:val="single" w:color="CCCCCC" w:sz="1"/>
+              <w:bottom w:val="single" w:color="CCCCCC" w:sz="1"/>
+              <w:right w:val="single" w:color="CCCCCC" w:sz="1"/>
+            </w:tcBorders>
+            <w:tcMar>
+              <w:top w:type="dxa" w:w="80"/>
+              <w:left w:type="dxa" w:w="120"/>
+              <w:bottom w:type="dxa" w:w="80"/>
+              <w:right w:type="dxa" w:w="120"/>
+            </w:tcMar>
+          </w:tcPr>
+          <w:p>
+            <w:r>
+              <w:rPr>
+                <w:sz w:val="18"/>
+                <w:szCs w:val="18"/>
+              </w:rPr>
+              <w:t xml:space="preserve">Communardo partners with Bregal Unternehmerkapital to drive growth strategy and European expansion</w:t>
+            </w:r>
+          </w:p>
+        </w:tc>
+        <w:tc>
+          <w:tcPr>
+            <w:tcW w:type="dxa" w:w="2360"/>
+            <w:tcBorders>
+              <w:top w:val="single" w:color="CCCCCC" w:sz="1"/>
+              <w:left w:val="single" w:color="CCCCCC" w:sz="1"/>
+              <w:bottom w:val="single" w:color="CCCCCC" w:sz="1"/>
+              <w:right w:val="single" w:color="CCCCCC" w:sz="1"/>
+            </w:tcBorders>
+            <w:tcMar>
+              <w:top w:type="dxa" w:w="80"/>
+              <w:left w:type="dxa" w:w="120"/>
+              <w:bottom w:type="dxa" w:w="80"/>
+              <w:right w:type="dxa" w:w="120"/>
+            </w:tcMar>
+          </w:tcPr>
+          <w:p>
+            <w:r>
+              <w:rPr>
+                <w:sz w:val="18"/>
+                <w:szCs w:val="18"/>
+              </w:rPr>
+              <w:t xml:space="preserve">Bregal Unternehmerkapital funds invested in Communardo Holding GmbH to accelerate its customer-centric growth strategy, European expansion, and service/software portfolio extension.</w:t>
+            </w:r>
+          </w:p>
+        </w:tc>
+      </w:tr>
+      <w:tr>
+        <w:tc>
+          <w:tcPr>
+            <w:tcW w:type="dxa" w:w="1500"/>
+            <w:tcBorders>
+              <w:top w:val="single" w:color="CCCCCC" w:sz="1"/>
+              <w:left w:val="single" w:color="CCCCCC" w:sz="1"/>
+              <w:bottom w:val="single" w:color="CCCCCC" w:sz="1"/>
+              <w:right w:val="single" w:color="CCCCCC" w:sz="1"/>
+            </w:tcBorders>
+            <w:tcMar>
+              <w:top w:type="dxa" w:w="80"/>
+              <w:left w:type="dxa" w:w="120"/>
+              <w:bottom w:type="dxa" w:w="80"/>
+              <w:right w:type="dxa" w:w="120"/>
+            </w:tcMar>
+          </w:tcPr>
+          <w:p>
+            <w:r>
+              <w:rPr>
+                <w:sz w:val="18"/>
+                <w:szCs w:val="18"/>
+              </w:rPr>
+              <w:t xml:space="preserve">2026-07-18</w:t>
+            </w:r>
+          </w:p>
+        </w:tc>
+        <w:tc>
+          <w:tcPr>
+            <w:tcW w:type="dxa" w:w="1300"/>
+            <w:tcBorders>
+              <w:top w:val="single" w:color="CCCCCC" w:sz="1"/>
+              <w:left w:val="single" w:color="CCCCCC" w:sz="1"/>
+              <w:bottom w:val="single" w:color="CCCCCC" w:sz="1"/>
+              <w:right w:val="single" w:color="CCCCCC" w:sz="1"/>
+            </w:tcBorders>
+            <w:tcMar>
+              <w:top w:type="dxa" w:w="80"/>
+              <w:left w:type="dxa" w:w="120"/>
+              <w:bottom w:type="dxa" w:w="80"/>
+              <w:right w:type="dxa" w:w="120"/>
+            </w:tcMar>
+          </w:tcPr>
+          <w:p>
+            <w:r>
+              <w:rPr>
+                <w:sz w:val="18"/>
+                <w:szCs w:val="18"/>
+              </w:rPr>
+              <w:t xml:space="preserve">positive</w:t>
+            </w:r>
+          </w:p>
+        </w:tc>
+        <w:tc>
+          <w:tcPr>
+            <w:tcW w:type="dxa" w:w="4200"/>
+            <w:tcBorders>
+              <w:top w:val="single" w:color="CCCCCC" w:sz="1"/>
+              <w:left w:val="single" w:color="CCCCCC" w:sz="1"/>
+              <w:bottom w:val="single" w:color="CCCCCC" w:sz="1"/>
+              <w:right w:val="single" w:color="CCCCCC" w:sz="1"/>
+            </w:tcBorders>
+            <w:tcMar>
+              <w:top w:type="dxa" w:w="80"/>
+              <w:left w:type="dxa" w:w="120"/>
+              <w:bottom w:type="dxa" w:w="80"/>
+              <w:right w:type="dxa" w:w="120"/>
+            </w:tcMar>
+          </w:tcPr>
+          <w:p>
+            <w:r>
+              <w:rPr>
+                <w:sz w:val="18"/>
+                <w:szCs w:val="18"/>
+              </w:rPr>
+              <w:t xml:space="preserve">Communardo expands Industry Advisory Board with Seidensticker and Kranebitter</w:t>
+            </w:r>
+          </w:p>
+        </w:tc>
+        <w:tc>
+          <w:tcPr>
+            <w:tcW w:type="dxa" w:w="2360"/>
+            <w:tcBorders>
+              <w:top w:val="single" w:color="CCCCCC" w:sz="1"/>
+              <w:left w:val="single" w:color="CCCCCC" w:sz="1"/>
+              <w:bottom w:val="single" w:color="CCCCCC" w:sz="1"/>
+              <w:right w:val="single" w:color="CCCCCC" w:sz="1"/>
+            </w:tcBorders>
+            <w:tcMar>
+              <w:top w:type="dxa" w:w="80"/>
+              <w:left w:type="dxa" w:w="120"/>
+              <w:bottom w:type="dxa" w:w="80"/>
+              <w:right w:type="dxa" w:w="120"/>
+            </w:tcMar>
+          </w:tcPr>
+          <w:p>
+            <w:r>
+              <w:rPr>
+                <w:sz w:val="18"/>
+                <w:szCs w:val="18"/>
+              </w:rPr>
+              <w:t xml:space="preserve">Communardo added Dr. Franz-Josef Seidensticker as Chairman and Christian Kranebitter to its Industry Advisory Board to support market expansion and process professionalization.</w:t>
+            </w:r>
+          </w:p>
+        </w:tc>
+      </w:tr>
+      <w:tr>
+        <w:tc>
+          <w:tcPr>
+            <w:tcW w:type="dxa" w:w="1500"/>
+            <w:tcBorders>
+              <w:top w:val="single" w:color="CCCCCC" w:sz="1"/>
+              <w:left w:val="single" w:color="CCCCCC" w:sz="1"/>
+              <w:bottom w:val="single" w:color="CCCCCC" w:sz="1"/>
+              <w:right w:val="single" w:color="CCCCCC" w:sz="1"/>
+            </w:tcBorders>
+            <w:tcMar>
+              <w:top w:type="dxa" w:w="80"/>
+              <w:left w:type="dxa" w:w="120"/>
+              <w:bottom w:type="dxa" w:w="80"/>
+              <w:right w:type="dxa" w:w="120"/>
+            </w:tcMar>
+          </w:tcPr>
+          <w:p>
+            <w:r>
+              <w:rPr>
+                <w:sz w:val="18"/>
+                <w:szCs w:val="18"/>
+              </w:rPr>
+              <w:t xml:space="preserve">2026-07-18</w:t>
+            </w:r>
+          </w:p>
+        </w:tc>
+        <w:tc>
+          <w:tcPr>
+            <w:tcW w:type="dxa" w:w="1300"/>
+            <w:tcBorders>
+              <w:top w:val="single" w:color="CCCCCC" w:sz="1"/>
+              <w:left w:val="single" w:color="CCCCCC" w:sz="1"/>
+              <w:bottom w:val="single" w:color="CCCCCC" w:sz="1"/>
+              <w:right w:val="single" w:color="CCCCCC" w:sz="1"/>
+            </w:tcBorders>
+            <w:tcMar>
+              <w:top w:type="dxa" w:w="80"/>
+              <w:left w:type="dxa" w:w="120"/>
+              <w:bottom w:type="dxa" w:w="80"/>
+              <w:right w:type="dxa" w:w="120"/>
+            </w:tcMar>
+          </w:tcPr>
+          <w:p>
+            <w:r>
+              <w:rPr>
+                <w:sz w:val="18"/>
+                <w:szCs w:val="18"/>
+              </w:rPr>
+              <w:t xml:space="preserve">positive</w:t>
+            </w:r>
+          </w:p>
+        </w:tc>
+        <w:tc>
+          <w:tcPr>
+            <w:tcW w:type="dxa" w:w="4200"/>
+            <w:tcBorders>
+              <w:top w:val="single" w:color="CCCCCC" w:sz="1"/>
+              <w:left w:val="single" w:color="CCCCCC" w:sz="1"/>
+              <w:bottom w:val="single" w:color="CCCCCC" w:sz="1"/>
+              <w:right w:val="single" w:color="CCCCCC" w:sz="1"/>
+            </w:tcBorders>
+            <w:tcMar>
+              <w:top w:type="dxa" w:w="80"/>
+              <w:left w:type="dxa" w:w="120"/>
+              <w:bottom w:type="dxa" w:w="80"/>
+              <w:right w:type="dxa" w:w="120"/>
+            </w:tcMar>
+          </w:tcPr>
+          <w:p>
+            <w:r>
+              <w:rPr>
+                <w:sz w:val="18"/>
+                <w:szCs w:val="18"/>
+              </w:rPr>
+              <w:t xml:space="preserve">Communardo enters Nordic market with acquisition of Stretch Addera in Sweden</w:t>
+            </w:r>
+          </w:p>
+        </w:tc>
+        <w:tc>
+          <w:tcPr>
+            <w:tcW w:type="dxa" w:w="2360"/>
+            <w:tcBorders>
+              <w:top w:val="single" w:color="CCCCCC" w:sz="1"/>
+              <w:left w:val="single" w:color="CCCCCC" w:sz="1"/>
+              <w:bottom w:val="single" w:color="CCCCCC" w:sz="1"/>
+              <w:right w:val="single" w:color="CCCCCC" w:sz="1"/>
+            </w:tcBorders>
+            <w:tcMar>
+              <w:top w:type="dxa" w:w="80"/>
+              <w:left w:type="dxa" w:w="120"/>
+              <w:bottom w:type="dxa" w:w="80"/>
+              <w:right w:type="dxa" w:w="120"/>
+            </w:tcMar>
+          </w:tcPr>
+          <w:p>
+            <w:r>
+              <w:rPr>
+                <w:sz w:val="18"/>
+                <w:szCs w:val="18"/>
+              </w:rPr>
+              <w:t xml:space="preserve">Communardo acquired Swedish Atlassian Platinum Solution Partner Stretch Addera, entering the Nordic market and reinforcing its position as a pan-European Atlassian leader.</w:t>
+            </w:r>
+          </w:p>
+        </w:tc>
+      </w:tr>
+      <w:tr>
+        <w:tc>
+          <w:tcPr>
+            <w:tcW w:type="dxa" w:w="1500"/>
+            <w:tcBorders>
+              <w:top w:val="single" w:color="CCCCCC" w:sz="1"/>
+              <w:left w:val="single" w:color="CCCCCC" w:sz="1"/>
+              <w:bottom w:val="single" w:color="CCCCCC" w:sz="1"/>
+              <w:right w:val="single" w:color="CCCCCC" w:sz="1"/>
+            </w:tcBorders>
+            <w:tcMar>
+              <w:top w:type="dxa" w:w="80"/>
+              <w:left w:type="dxa" w:w="120"/>
+              <w:bottom w:type="dxa" w:w="80"/>
+              <w:right w:type="dxa" w:w="120"/>
+            </w:tcMar>
+          </w:tcPr>
+          <w:p>
+            <w:r>
+              <w:rPr>
+                <w:sz w:val="18"/>
+                <w:szCs w:val="18"/>
+              </w:rPr>
+              <w:t xml:space="preserve">2026-07-18</w:t>
+            </w:r>
+          </w:p>
+        </w:tc>
+        <w:tc>
+          <w:tcPr>
+            <w:tcW w:type="dxa" w:w="1300"/>
+            <w:tcBorders>
+              <w:top w:val="single" w:color="CCCCCC" w:sz="1"/>
+              <w:left w:val="single" w:color="CCCCCC" w:sz="1"/>
+              <w:bottom w:val="single" w:color="CCCCCC" w:sz="1"/>
+              <w:right w:val="single" w:color="CCCCCC" w:sz="1"/>
+            </w:tcBorders>
+            <w:tcMar>
+              <w:top w:type="dxa" w:w="80"/>
+              <w:left w:type="dxa" w:w="120"/>
+              <w:bottom w:type="dxa" w:w="80"/>
+              <w:right w:type="dxa" w:w="120"/>
+            </w:tcMar>
+          </w:tcPr>
+          <w:p>
+            <w:r>
+              <w:rPr>
+                <w:sz w:val="18"/>
+                <w:szCs w:val="18"/>
+              </w:rPr>
+              <w:t xml:space="preserve">positive</w:t>
+            </w:r>
+          </w:p>
+        </w:tc>
+        <w:tc>
+          <w:tcPr>
+            <w:tcW w:type="dxa" w:w="4200"/>
+            <w:tcBorders>
+              <w:top w:val="single" w:color="CCCCCC" w:sz="1"/>
+              <w:left w:val="single" w:color="CCCCCC" w:sz="1"/>
+              <w:bottom w:val="single" w:color="CCCCCC" w:sz="1"/>
+              <w:right w:val="single" w:color="CCCCCC" w:sz="1"/>
+            </w:tcBorders>
+            <w:tcMar>
+              <w:top w:type="dxa" w:w="80"/>
+              <w:left w:type="dxa" w:w="120"/>
+              <w:bottom w:type="dxa" w:w="80"/>
+              <w:right w:type="dxa" w:w="120"/>
+            </w:tcMar>
+          </w:tcPr>
+          <w:p>
+            <w:r>
+              <w:rPr>
+                <w:sz w:val="18"/>
+                <w:szCs w:val="18"/>
+              </w:rPr>
+              <w:t xml:space="preserve">Partnership with Mibex strengthens software portfolio</w:t>
+            </w:r>
+          </w:p>
+        </w:tc>
+        <w:tc>
+          <w:tcPr>
+            <w:tcW w:type="dxa" w:w="2360"/>
+            <w:tcBorders>
+              <w:top w:val="single" w:color="CCCCCC" w:sz="1"/>
+              <w:left w:val="single" w:color="CCCCCC" w:sz="1"/>
+              <w:bottom w:val="single" w:color="CCCCCC" w:sz="1"/>
+              <w:right w:val="single" w:color="CCCCCC" w:sz="1"/>
+            </w:tcBorders>
+            <w:tcMar>
+              <w:top w:type="dxa" w:w="80"/>
+              <w:left w:type="dxa" w:w="120"/>
+              <w:bottom w:type="dxa" w:w="80"/>
+              <w:right w:type="dxa" w:w="120"/>
+            </w:tcMar>
+          </w:tcPr>
+          <w:p>
+            <w:r>
+              <w:rPr>
+                <w:sz w:val="18"/>
+                <w:szCs w:val="18"/>
+              </w:rPr>
+              <w:t xml:space="preserve">Communardo acquired Swiss Atlassian Gold Marketplace Partner Mibex Software, adding a DevOps-focused app portfolio serving over 2,700 customers.</w:t>
+            </w:r>
+          </w:p>
+        </w:tc>
+      </w:tr>
+      <w:tr>
+        <w:tc>
+          <w:tcPr>
+            <w:tcW w:type="dxa" w:w="1500"/>
+            <w:tcBorders>
+              <w:top w:val="single" w:color="CCCCCC" w:sz="1"/>
+              <w:left w:val="single" w:color="CCCCCC" w:sz="1"/>
+              <w:bottom w:val="single" w:color="CCCCCC" w:sz="1"/>
+              <w:right w:val="single" w:color="CCCCCC" w:sz="1"/>
+            </w:tcBorders>
+            <w:tcMar>
+              <w:top w:type="dxa" w:w="80"/>
+              <w:left w:type="dxa" w:w="120"/>
+              <w:bottom w:type="dxa" w:w="80"/>
+              <w:right w:type="dxa" w:w="120"/>
+            </w:tcMar>
+          </w:tcPr>
+          <w:p>
+            <w:r>
+              <w:rPr>
+                <w:sz w:val="18"/>
+                <w:szCs w:val="18"/>
+              </w:rPr>
+              <w:t xml:space="preserve">2026-07-18</w:t>
+            </w:r>
+          </w:p>
+        </w:tc>
+        <w:tc>
+          <w:tcPr>
+            <w:tcW w:type="dxa" w:w="1300"/>
+            <w:tcBorders>
+              <w:top w:val="single" w:color="CCCCCC" w:sz="1"/>
+              <w:left w:val="single" w:color="CCCCCC" w:sz="1"/>
+              <w:bottom w:val="single" w:color="CCCCCC" w:sz="1"/>
+              <w:right w:val="single" w:color="CCCCCC" w:sz="1"/>
+            </w:tcBorders>
+            <w:tcMar>
+              <w:top w:type="dxa" w:w="80"/>
+              <w:left w:type="dxa" w:w="120"/>
+              <w:bottom w:type="dxa" w:w="80"/>
+              <w:right w:type="dxa" w:w="120"/>
+            </w:tcMar>
+          </w:tcPr>
+          <w:p>
+            <w:r>
+              <w:rPr>
+                <w:sz w:val="18"/>
+                <w:szCs w:val="18"/>
+              </w:rPr>
+              <w:t xml:space="preserve">positive</w:t>
+            </w:r>
+          </w:p>
+        </w:tc>
+        <w:tc>
+          <w:tcPr>
+            <w:tcW w:type="dxa" w:w="4200"/>
+            <w:tcBorders>
+              <w:top w:val="single" w:color="CCCCCC" w:sz="1"/>
+              <w:left w:val="single" w:color="CCCCCC" w:sz="1"/>
+              <w:bottom w:val="single" w:color="CCCCCC" w:sz="1"/>
+              <w:right w:val="single" w:color="CCCCCC" w:sz="1"/>
+            </w:tcBorders>
+            <w:tcMar>
+              <w:top w:type="dxa" w:w="80"/>
+              <w:left w:type="dxa" w:w="120"/>
+              <w:bottom w:type="dxa" w:w="80"/>
+              <w:right w:type="dxa" w:w="120"/>
+            </w:tcMar>
+          </w:tcPr>
+          <w:p>
+            <w:r>
+              <w:rPr>
+                <w:sz w:val="18"/>
+                <w:szCs w:val="18"/>
+              </w:rPr>
+              <w:t xml:space="preserve">celix joins the Communardo Group</w:t>
+            </w:r>
+          </w:p>
+        </w:tc>
+        <w:tc>
+          <w:tcPr>
+            <w:tcW w:type="dxa" w:w="2360"/>
+            <w:tcBorders>
+              <w:top w:val="single" w:color="CCCCCC" w:sz="1"/>
+              <w:left w:val="single" w:color="CCCCCC" w:sz="1"/>
+              <w:bottom w:val="single" w:color="CCCCCC" w:sz="1"/>
+              <w:right w:val="single" w:color="CCCCCC" w:sz="1"/>
+            </w:tcBorders>
+            <w:tcMar>
+              <w:top w:type="dxa" w:w="80"/>
+              <w:left w:type="dxa" w:w="120"/>
+              <w:bottom w:type="dxa" w:w="80"/>
+              <w:right w:type="dxa" w:w="120"/>
+            </w:tcMar>
+          </w:tcPr>
+          <w:p>
+            <w:r>
+              <w:rPr>
+                <w:sz w:val="18"/>
+                <w:szCs w:val="18"/>
+              </w:rPr>
+              <w:t xml:space="preserve">Communardo acquired Austrian Atlassian Platinum Solution Partner celix Solutions GmbH, strengthening its market leadership in the DACH region.</w:t>
+            </w:r>
+          </w:p>
+        </w:tc>
+      </w:tr>
+      <w:tr>
+        <w:tc>
+          <w:tcPr>
+            <w:tcW w:type="dxa" w:w="1500"/>
+            <w:tcBorders>
+              <w:top w:val="single" w:color="CCCCCC" w:sz="1"/>
+              <w:left w:val="single" w:color="CCCCCC" w:sz="1"/>
+              <w:bottom w:val="single" w:color="CCCCCC" w:sz="1"/>
+              <w:right w:val="single" w:color="CCCCCC" w:sz="1"/>
+            </w:tcBorders>
+            <w:tcMar>
+              <w:top w:type="dxa" w:w="80"/>
+              <w:left w:type="dxa" w:w="120"/>
+              <w:bottom w:type="dxa" w:w="80"/>
+              <w:right w:type="dxa" w:w="120"/>
+            </w:tcMar>
+          </w:tcPr>
+          <w:p>
+            <w:r>
+              <w:rPr>
+                <w:sz w:val="18"/>
+                <w:szCs w:val="18"/>
+              </w:rPr>
+              <w:t xml:space="preserve">2026-07-16</w:t>
+            </w:r>
+          </w:p>
+        </w:tc>
+        <w:tc>
+          <w:tcPr>
+            <w:tcW w:type="dxa" w:w="1300"/>
+            <w:tcBorders>
+              <w:top w:val="single" w:color="CCCCCC" w:sz="1"/>
+              <w:left w:val="single" w:color="CCCCCC" w:sz="1"/>
+              <w:bottom w:val="single" w:color="CCCCCC" w:sz="1"/>
+              <w:right w:val="single" w:color="CCCCCC" w:sz="1"/>
+            </w:tcBorders>
+            <w:tcMar>
+              <w:top w:type="dxa" w:w="80"/>
+              <w:left w:type="dxa" w:w="120"/>
+              <w:bottom w:type="dxa" w:w="80"/>
+              <w:right w:type="dxa" w:w="120"/>
+            </w:tcMar>
+          </w:tcPr>
+          <w:p>
+            <w:r>
+              <w:rPr>
+                <w:sz w:val="18"/>
+                <w:szCs w:val="18"/>
+              </w:rPr>
+              <w:t xml:space="preserve">positive</w:t>
+            </w:r>
+          </w:p>
+        </w:tc>
+        <w:tc>
+          <w:tcPr>
+            <w:tcW w:type="dxa" w:w="4200"/>
+            <w:tcBorders>
+              <w:top w:val="single" w:color="CCCCCC" w:sz="1"/>
+              <w:left w:val="single" w:color="CCCCCC" w:sz="1"/>
+              <w:bottom w:val="single" w:color="CCCCCC" w:sz="1"/>
+              <w:right w:val="single" w:color="CCCCCC" w:sz="1"/>
+            </w:tcBorders>
+            <w:tcMar>
+              <w:top w:type="dxa" w:w="80"/>
+              <w:left w:type="dxa" w:w="120"/>
+              <w:bottom w:type="dxa" w:w="80"/>
+              <w:right w:type="dxa" w:w="120"/>
+            </w:tcMar>
+          </w:tcPr>
+          <w:p>
+            <w:r>
+              <w:rPr>
+                <w:sz w:val="18"/>
+                <w:szCs w:val="18"/>
+              </w:rPr>
+              <w:t xml:space="preserve">Communardo Group GmbH acquires Computas Opus, becoming Atlassian market leader in Norway</w:t>
+            </w:r>
+          </w:p>
+        </w:tc>
+        <w:tc>
+          <w:tcPr>
+            <w:tcW w:type="dxa" w:w="2360"/>
+            <w:tcBorders>
+              <w:top w:val="single" w:color="CCCCCC" w:sz="1"/>
+              <w:left w:val="single" w:color="CCCCCC" w:sz="1"/>
+              <w:bottom w:val="single" w:color="CCCCCC" w:sz="1"/>
+              <w:right w:val="single" w:color="CCCCCC" w:sz="1"/>
+            </w:tcBorders>
+            <w:tcMar>
+              <w:top w:type="dxa" w:w="80"/>
+              <w:left w:type="dxa" w:w="120"/>
+              <w:bottom w:type="dxa" w:w="80"/>
+              <w:right w:type="dxa" w:w="120"/>
+            </w:tcMar>
+          </w:tcPr>
+          <w:p>
+            <w:r>
+              <w:rPr>
+                <w:sz w:val="18"/>
+                <w:szCs w:val="18"/>
+              </w:rPr>
+              <w:t xml:space="preserve">Communardo acquired Norwegian Atlassian Platinum Partner Computas Opus, establishing itself as the market leader in Norway's Atlassian ecosystem.</w:t>
+            </w:r>
+          </w:p>
+        </w:tc>
+      </w:tr>
+      <w:tr>
+        <w:tc>
+          <w:tcPr>
+            <w:tcW w:type="dxa" w:w="1500"/>
+            <w:tcBorders>
+              <w:top w:val="single" w:color="CCCCCC" w:sz="1"/>
+              <w:left w:val="single" w:color="CCCCCC" w:sz="1"/>
+              <w:bottom w:val="single" w:color="CCCCCC" w:sz="1"/>
+              <w:right w:val="single" w:color="CCCCCC" w:sz="1"/>
+            </w:tcBorders>
+            <w:tcMar>
+              <w:top w:type="dxa" w:w="80"/>
+              <w:left w:type="dxa" w:w="120"/>
+              <w:bottom w:type="dxa" w:w="80"/>
+              <w:right w:type="dxa" w:w="120"/>
+            </w:tcMar>
+          </w:tcPr>
+          <w:p>
+            <w:r>
+              <w:rPr>
+                <w:sz w:val="18"/>
+                <w:szCs w:val="18"/>
+              </w:rPr>
+              <w:t xml:space="preserve">2026-07-16</w:t>
+            </w:r>
+          </w:p>
+        </w:tc>
+        <w:tc>
+          <w:tcPr>
+            <w:tcW w:type="dxa" w:w="1300"/>
+            <w:tcBorders>
+              <w:top w:val="single" w:color="CCCCCC" w:sz="1"/>
+              <w:left w:val="single" w:color="CCCCCC" w:sz="1"/>
+              <w:bottom w:val="single" w:color="CCCCCC" w:sz="1"/>
+              <w:right w:val="single" w:color="CCCCCC" w:sz="1"/>
+            </w:tcBorders>
+            <w:tcMar>
+              <w:top w:type="dxa" w:w="80"/>
+              <w:left w:type="dxa" w:w="120"/>
+              <w:bottom w:type="dxa" w:w="80"/>
+              <w:right w:type="dxa" w:w="120"/>
+            </w:tcMar>
+          </w:tcPr>
+          <w:p>
+            <w:r>
+              <w:rPr>
+                <w:sz w:val="18"/>
+                <w:szCs w:val="18"/>
+              </w:rPr>
+              <w:t xml:space="preserve">positive</w:t>
+            </w:r>
+          </w:p>
+        </w:tc>
+        <w:tc>
+          <w:tcPr>
+            <w:tcW w:type="dxa" w:w="4200"/>
+            <w:tcBorders>
+              <w:top w:val="single" w:color="CCCCCC" w:sz="1"/>
+              <w:left w:val="single" w:color="CCCCCC" w:sz="1"/>
+              <w:bottom w:val="single" w:color="CCCCCC" w:sz="1"/>
+              <w:right w:val="single" w:color="CCCCCC" w:sz="1"/>
+            </w:tcBorders>
+            <w:tcMar>
+              <w:top w:type="dxa" w:w="80"/>
+              <w:left w:type="dxa" w:w="120"/>
+              <w:bottom w:type="dxa" w:w="80"/>
+              <w:right w:type="dxa" w:w="120"/>
+            </w:tcMar>
+          </w:tcPr>
+          <w:p>
+            <w:r>
+              <w:rPr>
+                <w:sz w:val="18"/>
+                <w:szCs w:val="18"/>
+              </w:rPr>
+              <w:t xml:space="preserve">Communardo Experts launches as a joint venture with Spirit Experts in Morocco</w:t>
+            </w:r>
+          </w:p>
+        </w:tc>
+        <w:tc>
+          <w:tcPr>
+            <w:tcW w:type="dxa" w:w="2360"/>
+            <w:tcBorders>
+              <w:top w:val="single" w:color="CCCCCC" w:sz="1"/>
+              <w:left w:val="single" w:color="CCCCCC" w:sz="1"/>
+              <w:bottom w:val="single" w:color="CCCCCC" w:sz="1"/>
+              <w:right w:val="single" w:color="CCCCCC" w:sz="1"/>
+            </w:tcBorders>
+            <w:tcMar>
+              <w:top w:type="dxa" w:w="80"/>
+              <w:left w:type="dxa" w:w="120"/>
+              <w:bottom w:type="dxa" w:w="80"/>
+              <w:right w:type="dxa" w:w="120"/>
+            </w:tcMar>
+          </w:tcPr>
+          <w:p>
+            <w:r>
+              <w:rPr>
+                <w:sz w:val="18"/>
+                <w:szCs w:val="18"/>
+              </w:rPr>
+              <w:t xml:space="preserve">Communardo formed a joint venture, Communardo Experts GmbH, with Spirit Experts to build an Atlassian delivery hub in Casablanca, extending into the MENA region.</w:t>
+            </w:r>
+          </w:p>
+        </w:tc>
+      </w:tr>
+      <w:tr>
+        <w:tc>
+          <w:tcPr>
+            <w:tcW w:type="dxa" w:w="1500"/>
+            <w:tcBorders>
+              <w:top w:val="single" w:color="CCCCCC" w:sz="1"/>
+              <w:left w:val="single" w:color="CCCCCC" w:sz="1"/>
+              <w:bottom w:val="single" w:color="CCCCCC" w:sz="1"/>
+              <w:right w:val="single" w:color="CCCCCC" w:sz="1"/>
+            </w:tcBorders>
+            <w:tcMar>
+              <w:top w:type="dxa" w:w="80"/>
+              <w:left w:type="dxa" w:w="120"/>
+              <w:bottom w:type="dxa" w:w="80"/>
+              <w:right w:type="dxa" w:w="120"/>
+            </w:tcMar>
+          </w:tcPr>
+          <w:p>
+            <w:r>
+              <w:rPr>
+                <w:sz w:val="18"/>
+                <w:szCs w:val="18"/>
+              </w:rPr>
+              <w:t xml:space="preserve">2026-07-16</w:t>
+            </w:r>
+          </w:p>
+        </w:tc>
+        <w:tc>
+          <w:tcPr>
+            <w:tcW w:type="dxa" w:w="1300"/>
+            <w:tcBorders>
+              <w:top w:val="single" w:color="CCCCCC" w:sz="1"/>
+              <w:left w:val="single" w:color="CCCCCC" w:sz="1"/>
+              <w:bottom w:val="single" w:color="CCCCCC" w:sz="1"/>
+              <w:right w:val="single" w:color="CCCCCC" w:sz="1"/>
+            </w:tcBorders>
+            <w:tcMar>
+              <w:top w:type="dxa" w:w="80"/>
+              <w:left w:type="dxa" w:w="120"/>
+              <w:bottom w:type="dxa" w:w="80"/>
+              <w:right w:type="dxa" w:w="120"/>
+            </w:tcMar>
+          </w:tcPr>
+          <w:p>
+            <w:r>
+              <w:rPr>
+                <w:sz w:val="18"/>
+                <w:szCs w:val="18"/>
+              </w:rPr>
+              <w:t xml:space="preserve">positive</w:t>
+            </w:r>
+          </w:p>
+        </w:tc>
+        <w:tc>
+          <w:tcPr>
+            <w:tcW w:type="dxa" w:w="4200"/>
+            <w:tcBorders>
+              <w:top w:val="single" w:color="CCCCCC" w:sz="1"/>
+              <w:left w:val="single" w:color="CCCCCC" w:sz="1"/>
+              <w:bottom w:val="single" w:color="CCCCCC" w:sz="1"/>
+              <w:right w:val="single" w:color="CCCCCC" w:sz="1"/>
+            </w:tcBorders>
+            <w:tcMar>
+              <w:top w:type="dxa" w:w="80"/>
+              <w:left w:type="dxa" w:w="120"/>
+              <w:bottom w:type="dxa" w:w="80"/>
+              <w:right w:type="dxa" w:w="120"/>
+            </w:tcMar>
+          </w:tcPr>
+          <w:p>
+            <w:r>
+              <w:rPr>
+                <w:sz w:val="18"/>
+                <w:szCs w:val="18"/>
+              </w:rPr>
+              <w:t xml:space="preserve">Florence Heinen appointed VP Operations Atlassian Professional Services</w:t>
+            </w:r>
+          </w:p>
+        </w:tc>
+        <w:tc>
+          <w:tcPr>
+            <w:tcW w:type="dxa" w:w="2360"/>
+            <w:tcBorders>
+              <w:top w:val="single" w:color="CCCCCC" w:sz="1"/>
+              <w:left w:val="single" w:color="CCCCCC" w:sz="1"/>
+              <w:bottom w:val="single" w:color="CCCCCC" w:sz="1"/>
+              <w:right w:val="single" w:color="CCCCCC" w:sz="1"/>
+            </w:tcBorders>
+            <w:tcMar>
+              <w:top w:type="dxa" w:w="80"/>
+              <w:left w:type="dxa" w:w="120"/>
+              <w:bottom w:type="dxa" w:w="80"/>
+              <w:right w:type="dxa" w:w="120"/>
+            </w:tcMar>
+          </w:tcPr>
+          <w:p>
+            <w:r>
+              <w:rPr>
+                <w:sz w:val="18"/>
+                <w:szCs w:val="18"/>
+              </w:rPr>
+              <w:t xml:space="preserve">Communardo created a new group-level leadership role, naming Florence Heinen VP Operations for Atlassian Professional Services effective June 1, 2026.</w:t>
             </w:r>
           </w:p>
         </w:tc>

</xml_diff>

<commit_message>
Switch financial currency from EUR to USD (app_config.json, config.py default, 6 revenue sub-metrics amended, report generator fallbacks)
</commit_message>
<xml_diff>
--- a/reports/Orbit2_Report_Atlassian_2026-Q3.docx
+++ b/reports/Orbit2_Report_Atlassian_2026-Q3.docx
@@ -1734,7 +1734,7 @@
                 <w:sz w:val="18"/>
                 <w:szCs w:val="18"/>
               </w:rPr>
-              <w:t xml:space="preserve">0 / 500000 EUR</w:t>
+              <w:t xml:space="preserve">0 / 500000 USD</w:t>
             </w:r>
           </w:p>
         </w:tc>
@@ -1901,7 +1901,7 @@
                 <w:sz w:val="18"/>
                 <w:szCs w:val="18"/>
               </w:rPr>
-              <w:t xml:space="preserve">0 / 1200000 EUR</w:t>
+              <w:t xml:space="preserve">0 / 1200000 USD</w:t>
             </w:r>
           </w:p>
         </w:tc>
@@ -6250,7 +6250,7 @@
                 <w:sz w:val="18"/>
                 <w:szCs w:val="18"/>
               </w:rPr>
-              <w:t xml:space="preserve">0 / 300000 EUR</w:t>
+              <w:t xml:space="preserve">0 / 300000 USD</w:t>
             </w:r>
           </w:p>
         </w:tc>
@@ -6751,7 +6751,7 @@
                 <w:sz w:val="18"/>
                 <w:szCs w:val="18"/>
               </w:rPr>
-              <w:t xml:space="preserve">0 / 400000 EUR</w:t>
+              <w:t xml:space="preserve">0 / 400000 USD</w:t>
             </w:r>
           </w:p>
         </w:tc>
@@ -7448,7 +7448,7 @@
                 <w:sz w:val="18"/>
                 <w:szCs w:val="18"/>
               </w:rPr>
-              <w:t xml:space="preserve">0 / 400000 EUR</w:t>
+              <w:t xml:space="preserve">0 / 400000 USD</w:t>
             </w:r>
           </w:p>
         </w:tc>
@@ -7978,7 +7978,7 @@
                 <w:sz w:val="18"/>
                 <w:szCs w:val="18"/>
               </w:rPr>
-              <w:t xml:space="preserve">0 / 600000 EUR</w:t>
+              <w:t xml:space="preserve">0 / 600000 USD</w:t>
             </w:r>
           </w:p>
         </w:tc>
@@ -8314,7 +8314,7 @@
           <w:sz w:val="20"/>
           <w:szCs w:val="20"/>
         </w:rPr>
-        <w:t xml:space="preserve">Logged mentions: 15 total — 15 positive, 0 neutral, 0 negative.</w:t>
+        <w:t xml:space="preserve">Logged mentions: 28 total — 28 positive, 0 neutral, 0 negative.</w:t>
       </w:r>
     </w:p>
     <w:tbl>
@@ -8532,7 +8532,7 @@
                 <w:sz w:val="18"/>
                 <w:szCs w:val="18"/>
               </w:rPr>
-              <w:t xml:space="preserve">Communardo Products rebrands as Elevatic unifying Marketplace app portfolio</w:t>
+              <w:t xml:space="preserve">Communardo GmbH - Atlassian Solutions Partner Directory listing</w:t>
             </w:r>
           </w:p>
         </w:tc>
@@ -8558,7 +8558,7 @@
                 <w:sz w:val="18"/>
                 <w:szCs w:val="18"/>
               </w:rPr>
-              <w:t xml:space="preserve">Communardo Products rebranded as Elevatic, consolidating the former Communardo Products, bitvoodoo, and Mibex brands into one independent Atlassian Marketplace vendor.</w:t>
+              <w:t xml:space="preserve">Atlassian's official partner directory profile for Communardo GmbH shows Platinum Solution Partner status, a 5.0 rating, and Atlassian Partner of the Year awards for 2019, 2023, and 2025 (Cloud Platform Solutions).</w:t>
             </w:r>
           </w:p>
         </w:tc>
@@ -8638,7 +8638,7 @@
                 <w:sz w:val="18"/>
                 <w:szCs w:val="18"/>
               </w:rPr>
-              <w:t xml:space="preserve">Anje Hickey appointed CEO for Atlassian Professional Services in Europe</w:t>
+              <w:t xml:space="preserve">Stretch Addera joins Communardo Group</w:t>
             </w:r>
           </w:p>
         </w:tc>
@@ -8664,7 +8664,7 @@
                 <w:sz w:val="18"/>
                 <w:szCs w:val="18"/>
               </w:rPr>
-              <w:t xml:space="preserve">Communardo named Anje Hickey, former CEO of Fellowmind Germany and 12-year Microsoft veteran, as CEO of its Atlassian Professional Services business across Europe effective January 1, 2026.</w:t>
+              <w:t xml:space="preserve">Mirror of the Communardo Nordics blog post on stretchaddera.com, announcing Stretch Addera joining the Communardo Group.</w:t>
             </w:r>
           </w:p>
         </w:tc>
@@ -8744,7 +8744,7 @@
                 <w:sz w:val="18"/>
                 <w:szCs w:val="18"/>
               </w:rPr>
-              <w:t xml:space="preserve">Communardo partners with Bregal Unternehmerkapital to drive growth strategy and European expansion</w:t>
+              <w:t xml:space="preserve">Expanding Nordic Coverage: Communardo Group Adds Ambientia's Atlassian Business</w:t>
             </w:r>
           </w:p>
         </w:tc>
@@ -8770,7 +8770,7 @@
                 <w:sz w:val="18"/>
                 <w:szCs w:val="18"/>
               </w:rPr>
-              <w:t xml:space="preserve">Bregal Unternehmerkapital funds invested in Communardo Holding GmbH to accelerate its customer-centric growth strategy, European expansion, and service/software portfolio extension.</w:t>
+              <w:t xml:space="preserve">Mirror of the Communardo Nordics blog post on stretchaddera.com, covering the Ambientia Atlassian business acquisition in Finland.</w:t>
             </w:r>
           </w:p>
         </w:tc>
@@ -8850,7 +8850,7 @@
                 <w:sz w:val="18"/>
                 <w:szCs w:val="18"/>
               </w:rPr>
-              <w:t xml:space="preserve">Communardo expands Industry Advisory Board with Seidensticker and Kranebitter</w:t>
+              <w:t xml:space="preserve">Stretch Addera joins Communardo Group</w:t>
             </w:r>
           </w:p>
         </w:tc>
@@ -8876,7 +8876,7 @@
                 <w:sz w:val="18"/>
                 <w:szCs w:val="18"/>
               </w:rPr>
-              <w:t xml:space="preserve">Communardo added Dr. Franz-Josef Seidensticker as Chairman and Christian Kranebitter to its Industry Advisory Board to support market expansion and process professionalization.</w:t>
+              <w:t xml:space="preserve">Communardo Nordics (formerly Stretch Addera) blog post (May 27, 2025) announcing Stretch Addera joining the Communardo Group, forming a group of 420+ Atlassian experts.</w:t>
             </w:r>
           </w:p>
         </w:tc>
@@ -8956,7 +8956,7 @@
                 <w:sz w:val="18"/>
                 <w:szCs w:val="18"/>
               </w:rPr>
-              <w:t xml:space="preserve">Communardo enters Nordic market with acquisition of Stretch Addera in Sweden</w:t>
+              <w:t xml:space="preserve">Expanding Nordic Coverage: Communardo Group Adds Ambientia's Atlassian Business</w:t>
             </w:r>
           </w:p>
         </w:tc>
@@ -8982,7 +8982,7 @@
                 <w:sz w:val="18"/>
                 <w:szCs w:val="18"/>
               </w:rPr>
-              <w:t xml:space="preserve">Communardo acquired Swedish Atlassian Platinum Solution Partner Stretch Addera, entering the Nordic market and reinforcing its position as a pan-European Atlassian leader.</w:t>
+              <w:t xml:space="preserve">Communardo Nordics blog post (Jan 8, 2026) on the acquisition of Ambientia's Atlassian business in Finland, extending Nordic coverage to Sweden, Norway, Denmark, and Finland.</w:t>
             </w:r>
           </w:p>
         </w:tc>
@@ -9062,7 +9062,7 @@
                 <w:sz w:val="18"/>
                 <w:szCs w:val="18"/>
               </w:rPr>
-              <w:t xml:space="preserve">Partnership with Mibex strengthens software portfolio</w:t>
+              <w:t xml:space="preserve">German Communardo Group, backed by Bregal Unternehmerkapital (BU), acquires Swedish Atlassian partner Stretch Addera</w:t>
             </w:r>
           </w:p>
         </w:tc>
@@ -9088,7 +9088,7 @@
                 <w:sz w:val="18"/>
                 <w:szCs w:val="18"/>
               </w:rPr>
-              <w:t xml:space="preserve">Communardo acquired Swiss Atlassian Gold Marketplace Partner Mibex Software, adding a DevOps-focused app portfolio serving over 2,700 customers.</w:t>
+              <w:t xml:space="preserve">M&amp;A intelligence tracker NKP/Mainsights' historical coverage (May 27, 2025) of Communardo Group's acquisition of Swedish Atlassian partner Stretch Addera, including deal financial details.</w:t>
             </w:r>
           </w:p>
         </w:tc>
@@ -9168,7 +9168,7 @@
                 <w:sz w:val="18"/>
                 <w:szCs w:val="18"/>
               </w:rPr>
-              <w:t xml:space="preserve">celix joins the Communardo Group</w:t>
+              <w:t xml:space="preserve">Communardo Group extends Nordic platform with the acquisition of Aety</w:t>
             </w:r>
           </w:p>
         </w:tc>
@@ -9194,7 +9194,7 @@
                 <w:sz w:val="18"/>
                 <w:szCs w:val="18"/>
               </w:rPr>
-              <w:t xml:space="preserve">Communardo acquired Austrian Atlassian Platinum Solution Partner celix Solutions GmbH, strengthening its market leadership in the DACH region.</w:t>
+              <w:t xml:space="preserve">Danish law firm Accura's case page describing its advisory role for Communardo Group in its acquisition of Aety, extending the group's Nordic Atlassian platform to roughly 100 specialists.</w:t>
             </w:r>
           </w:p>
         </w:tc>
@@ -9222,7 +9222,7 @@
                 <w:sz w:val="18"/>
                 <w:szCs w:val="18"/>
               </w:rPr>
-              <w:t xml:space="preserve">2026-07-16</w:t>
+              <w:t xml:space="preserve">2026-07-18</w:t>
             </w:r>
           </w:p>
         </w:tc>
@@ -9274,7 +9274,7 @@
                 <w:sz w:val="18"/>
                 <w:szCs w:val="18"/>
               </w:rPr>
-              <w:t xml:space="preserve">Communardo Group GmbH acquires Computas Opus, becoming Atlassian market leader in Norway</w:t>
+              <w:t xml:space="preserve">Acquisition Strengthens Communardo's Market Position in Germany</w:t>
             </w:r>
           </w:p>
         </w:tc>
@@ -9300,7 +9300,7 @@
                 <w:sz w:val="18"/>
                 <w:szCs w:val="18"/>
               </w:rPr>
-              <w:t xml:space="preserve">Communardo acquired Norwegian Atlassian Platinum Partner Computas Opus, establishing itself as the market leader in Norway's Atlassian ecosystem.</w:t>
+              <w:t xml:space="preserve">Communardo blog post (April 25, 2024) announcing the integration of German IT service provider Scolution into the Communardo Group, strengthening its Atlassian market position and regional presence in Swabian Hall.</w:t>
             </w:r>
           </w:p>
         </w:tc>
@@ -9328,7 +9328,7 @@
                 <w:sz w:val="18"/>
                 <w:szCs w:val="18"/>
               </w:rPr>
-              <w:t xml:space="preserve">2026-07-16</w:t>
+              <w:t xml:space="preserve">2026-07-18</w:t>
             </w:r>
           </w:p>
         </w:tc>
@@ -9380,7 +9380,7 @@
                 <w:sz w:val="18"/>
                 <w:szCs w:val="18"/>
               </w:rPr>
-              <w:t xml:space="preserve">Communardo Experts launches as a joint venture with Spirit Experts in Morocco</w:t>
+              <w:t xml:space="preserve">Communardo Group welcomes Stretch Addera as a new partner</w:t>
             </w:r>
           </w:p>
         </w:tc>
@@ -9406,7 +9406,7 @@
                 <w:sz w:val="18"/>
                 <w:szCs w:val="18"/>
               </w:rPr>
-              <w:t xml:space="preserve">Communardo formed a joint venture, Communardo Experts GmbH, with Spirit Experts to build an Atlassian delivery hub in Casablanca, extending into the MENA region.</w:t>
+              <w:t xml:space="preserve">BU Partners' coverage of Communardo Group welcoming Swedish Atlassian Platinum Partner Stretch Addera, marking its Nordic market entry.</w:t>
             </w:r>
           </w:p>
         </w:tc>
@@ -9434,7 +9434,7 @@
                 <w:sz w:val="18"/>
                 <w:szCs w:val="18"/>
               </w:rPr>
-              <w:t xml:space="preserve">2026-07-16</w:t>
+              <w:t xml:space="preserve">2026-07-18</w:t>
             </w:r>
           </w:p>
         </w:tc>
@@ -9486,7 +9486,7 @@
                 <w:sz w:val="18"/>
                 <w:szCs w:val="18"/>
               </w:rPr>
-              <w:t xml:space="preserve">Florence Heinen appointed VP Operations Atlassian Professional Services</w:t>
+              <w:t xml:space="preserve">Communardo Has Agreed to be Acquired by Bregal Unternehmerkapital</w:t>
             </w:r>
           </w:p>
         </w:tc>
@@ -9512,7 +9512,7 @@
                 <w:sz w:val="18"/>
                 <w:szCs w:val="18"/>
               </w:rPr>
-              <w:t xml:space="preserve">Communardo created a new group-level leadership role, naming Florence Heinen VP Operations for Atlassian Professional Services effective June 1, 2026.</w:t>
+              <w:t xml:space="preserve">William Blair announced (Sept 4, 2024) it acted as exclusive financial advisor to Communardo, then a PROM12 portfolio company, on its agreed sale to Bregal Unternehmerkapital.</w:t>
             </w:r>
           </w:p>
         </w:tc>

</xml_diff>

<commit_message>
Contacts Phase 1 (R3-T01, pulled forward): identity resolution engine, contacts.csv/contact_aliases.csv/contact_evidence.jsonl registers, migration 003, validators, tests
</commit_message>
<xml_diff>
--- a/reports/Orbit2_Report_Atlassian_2026-Q3.docx
+++ b/reports/Orbit2_Report_Atlassian_2026-Q3.docx
@@ -20,7 +20,7 @@
           <w:sz w:val="18"/>
           <w:szCs w:val="18"/>
         </w:rPr>
-        <w:t xml:space="preserve">Generated 2026-07-18 · Prepared for Steve Mojsak, Atlassian Alliance Manager, Communardo</w:t>
+        <w:t xml:space="preserve">Generated 2026-07-21 · Prepared for Steve Mojsak, Atlassian Alliance Manager, Communardo</w:t>
       </w:r>
     </w:p>
     <w:p>
@@ -8314,7 +8314,7 @@
           <w:sz w:val="20"/>
           <w:szCs w:val="20"/>
         </w:rPr>
-        <w:t xml:space="preserve">Logged mentions: 28 total — 28 positive, 0 neutral, 0 negative.</w:t>
+        <w:t xml:space="preserve">Logged mentions: 38 total — 37 positive, 1 neutral, 0 negative.</w:t>
       </w:r>
     </w:p>
     <w:tbl>
@@ -8480,7 +8480,7 @@
                 <w:sz w:val="18"/>
                 <w:szCs w:val="18"/>
               </w:rPr>
-              <w:t xml:space="preserve">2026-07-18</w:t>
+              <w:t xml:space="preserve">2026-07-20</w:t>
             </w:r>
           </w:p>
         </w:tc>
@@ -8506,7 +8506,7 @@
                 <w:sz w:val="18"/>
                 <w:szCs w:val="18"/>
               </w:rPr>
-              <w:t xml:space="preserve">positive</w:t>
+              <w:t xml:space="preserve">neutral</w:t>
             </w:r>
           </w:p>
         </w:tc>
@@ -8532,7 +8532,7 @@
                 <w:sz w:val="18"/>
                 <w:szCs w:val="18"/>
               </w:rPr>
-              <w:t xml:space="preserve">Communardo GmbH - Atlassian Solutions Partner Directory listing</w:t>
+              <w:t xml:space="preserve">Elevatic - Atlassian Marketplace vendor listing</w:t>
             </w:r>
           </w:p>
         </w:tc>
@@ -8558,7 +8558,7 @@
                 <w:sz w:val="18"/>
                 <w:szCs w:val="18"/>
               </w:rPr>
-              <w:t xml:space="preserve">Atlassian's official partner directory profile for Communardo GmbH shows Platinum Solution Partner status, a 5.0 rating, and Atlassian Partner of the Year awards for 2019, 2023, and 2025 (Cloud Platform Solutions).</w:t>
+              <w:t xml:space="preserve">Atlassian Marketplace vendor profile for Elevatic (formerly Communardo Products, bitvoodoo, and Mibex), listing Platinum Marketplace and Solution Partner status and its portfolio of 16+ Confluence/Jira/Bitbucket apps.</w:t>
             </w:r>
           </w:p>
         </w:tc>
@@ -8586,7 +8586,7 @@
                 <w:sz w:val="18"/>
                 <w:szCs w:val="18"/>
               </w:rPr>
-              <w:t xml:space="preserve">2026-07-18</w:t>
+              <w:t xml:space="preserve">2026-07-20</w:t>
             </w:r>
           </w:p>
         </w:tc>
@@ -8638,7 +8638,7 @@
                 <w:sz w:val="18"/>
                 <w:szCs w:val="18"/>
               </w:rPr>
-              <w:t xml:space="preserve">Stretch Addera joins Communardo Group</w:t>
+              <w:t xml:space="preserve">Communardo Switzerland - Atlassian Solutions Partner Directory listing</w:t>
             </w:r>
           </w:p>
         </w:tc>
@@ -8664,7 +8664,7 @@
                 <w:sz w:val="18"/>
                 <w:szCs w:val="18"/>
               </w:rPr>
-              <w:t xml:space="preserve">Mirror of the Communardo Nordics blog post on stretchaddera.com, announcing Stretch Addera joining the Communardo Group.</w:t>
+              <w:t xml:space="preserve">Atlassian's official partner directory profile for Communardo Switzerland (formerly bitvoodoo) shows Platinum Solution Partner status, 46 sales and 24 delivery accreditations, and a 2023 Marketing Innovator award.</w:t>
             </w:r>
           </w:p>
         </w:tc>
@@ -8692,7 +8692,7 @@
                 <w:sz w:val="18"/>
                 <w:szCs w:val="18"/>
               </w:rPr>
-              <w:t xml:space="preserve">2026-07-18</w:t>
+              <w:t xml:space="preserve">2026-07-20</w:t>
             </w:r>
           </w:p>
         </w:tc>
@@ -8744,7 +8744,7 @@
                 <w:sz w:val="18"/>
                 <w:szCs w:val="18"/>
               </w:rPr>
-              <w:t xml:space="preserve">Expanding Nordic Coverage: Communardo Group Adds Ambientia's Atlassian Business</w:t>
+              <w:t xml:space="preserve">BU-backed Communardo adds on Stretch Addera</w:t>
             </w:r>
           </w:p>
         </w:tc>
@@ -8770,7 +8770,7 @@
                 <w:sz w:val="18"/>
                 <w:szCs w:val="18"/>
               </w:rPr>
-              <w:t xml:space="preserve">Mirror of the Communardo Nordics blog post on stretchaddera.com, covering the Ambientia Atlassian business acquisition in Finland.</w:t>
+              <w:t xml:space="preserve">PE Hub's private-equity trade coverage of BU-backed Communardo Group's add-on acquisition of Swedish Atlassian partner Stretch Addera.</w:t>
             </w:r>
           </w:p>
         </w:tc>
@@ -8798,7 +8798,7 @@
                 <w:sz w:val="18"/>
                 <w:szCs w:val="18"/>
               </w:rPr>
-              <w:t xml:space="preserve">2026-07-18</w:t>
+              <w:t xml:space="preserve">2026-07-20</w:t>
             </w:r>
           </w:p>
         </w:tc>
@@ -8850,7 +8850,7 @@
                 <w:sz w:val="18"/>
                 <w:szCs w:val="18"/>
               </w:rPr>
-              <w:t xml:space="preserve">Stretch Addera joins Communardo Group</w:t>
+              <w:t xml:space="preserve">Communardo Acquires Stretch Addera from Stretch AB</w:t>
             </w:r>
           </w:p>
         </w:tc>
@@ -8876,7 +8876,7 @@
                 <w:sz w:val="18"/>
                 <w:szCs w:val="18"/>
               </w:rPr>
-              <w:t xml:space="preserve">Communardo Nordics (formerly Stretch Addera) blog post (May 27, 2025) announcing Stretch Addera joining the Communardo Group, forming a group of 420+ Atlassian experts.</w:t>
+              <w:t xml:space="preserve">Global Legal Chronicle's coverage of Communardo Group's acquisition of Stretch Addera AB, a leading Atlassian Platinum Solution Partner in Sweden, and the legal advisors involved.</w:t>
             </w:r>
           </w:p>
         </w:tc>
@@ -8904,7 +8904,7 @@
                 <w:sz w:val="18"/>
                 <w:szCs w:val="18"/>
               </w:rPr>
-              <w:t xml:space="preserve">2026-07-18</w:t>
+              <w:t xml:space="preserve">2026-07-20</w:t>
             </w:r>
           </w:p>
         </w:tc>
@@ -8956,7 +8956,7 @@
                 <w:sz w:val="18"/>
                 <w:szCs w:val="18"/>
               </w:rPr>
-              <w:t xml:space="preserve">Expanding Nordic Coverage: Communardo Group Adds Ambientia's Atlassian Business</w:t>
+              <w:t xml:space="preserve">Paul Hastings advises BU Bregal Unternehmerkapital on acquisition of Stretch Addera by Communardo</w:t>
             </w:r>
           </w:p>
         </w:tc>
@@ -8982,7 +8982,7 @@
                 <w:sz w:val="18"/>
                 <w:szCs w:val="18"/>
               </w:rPr>
-              <w:t xml:space="preserve">Communardo Nordics blog post (Jan 8, 2026) on the acquisition of Ambientia's Atlassian business in Finland, extending Nordic coverage to Sweden, Norway, Denmark, and Finland.</w:t>
+              <w:t xml:space="preserve">Law firm Paul Hastings announced it advised BU Bregal Unternehmerkapital on Communardo's acquisition of Swedish Atlassian Platinum Solution Partner Stretch Addera, marking Communardo's entry into the Nordic market.</w:t>
             </w:r>
           </w:p>
         </w:tc>
@@ -9010,7 +9010,7 @@
                 <w:sz w:val="18"/>
                 <w:szCs w:val="18"/>
               </w:rPr>
-              <w:t xml:space="preserve">2026-07-18</w:t>
+              <w:t xml:space="preserve">2026-07-20</w:t>
             </w:r>
           </w:p>
         </w:tc>
@@ -9062,7 +9062,7 @@
                 <w:sz w:val="18"/>
                 <w:szCs w:val="18"/>
               </w:rPr>
-              <w:t xml:space="preserve">German Communardo Group, backed by Bregal Unternehmerkapital (BU), acquires Swedish Atlassian partner Stretch Addera</w:t>
+              <w:t xml:space="preserve">Communardo and Mibex Software join forces</w:t>
             </w:r>
           </w:p>
         </w:tc>
@@ -9088,7 +9088,7 @@
                 <w:sz w:val="18"/>
                 <w:szCs w:val="18"/>
               </w:rPr>
-              <w:t xml:space="preserve">M&amp;A intelligence tracker NKP/Mainsights' historical coverage (May 27, 2025) of Communardo Group's acquisition of Swedish Atlassian partner Stretch Addera, including deal financial details.</w:t>
+              <w:t xml:space="preserve">Communardo Group's own press release (Dec 17, 2024) announcing its acquisition of Swiss Atlassian Gold Marketplace Partner Mibex Software, strengthening its DevOps app portfolio serving 2,700+ customers.</w:t>
             </w:r>
           </w:p>
         </w:tc>
@@ -9116,7 +9116,7 @@
                 <w:sz w:val="18"/>
                 <w:szCs w:val="18"/>
               </w:rPr>
-              <w:t xml:space="preserve">2026-07-18</w:t>
+              <w:t xml:space="preserve">2026-07-20</w:t>
             </w:r>
           </w:p>
         </w:tc>
@@ -9168,7 +9168,7 @@
                 <w:sz w:val="18"/>
                 <w:szCs w:val="18"/>
               </w:rPr>
-              <w:t xml:space="preserve">Communardo Group extends Nordic platform with the acquisition of Aety</w:t>
+              <w:t xml:space="preserve">SWNetwork joins the Communardo Group and strengthens DevOps capabilities</w:t>
             </w:r>
           </w:p>
         </w:tc>
@@ -9194,7 +9194,7 @@
                 <w:sz w:val="18"/>
                 <w:szCs w:val="18"/>
               </w:rPr>
-              <w:t xml:space="preserve">Danish law firm Accura's case page describing its advisory role for Communardo Group in its acquisition of Aety, extending the group's Nordic Atlassian platform to roughly 100 specialists.</w:t>
+              <w:t xml:space="preserve">Communardo Group acquired Atlassian DevOps specialist SWNetwork (founded 2016), strengthening its DevOps consulting and solution development capabilities; all SWNetwork employees join Communardo's existing DevOps team.</w:t>
             </w:r>
           </w:p>
         </w:tc>
@@ -9222,7 +9222,7 @@
                 <w:sz w:val="18"/>
                 <w:szCs w:val="18"/>
               </w:rPr>
-              <w:t xml:space="preserve">2026-07-18</w:t>
+              <w:t xml:space="preserve">2026-07-19</w:t>
             </w:r>
           </w:p>
         </w:tc>
@@ -9274,7 +9274,7 @@
                 <w:sz w:val="18"/>
                 <w:szCs w:val="18"/>
               </w:rPr>
-              <w:t xml:space="preserve">Acquisition Strengthens Communardo's Market Position in Germany</w:t>
+              <w:t xml:space="preserve">Communardo strengthens its presence in Norway through the acquisition of Computas Opus</w:t>
             </w:r>
           </w:p>
         </w:tc>
@@ -9300,7 +9300,7 @@
                 <w:sz w:val="18"/>
                 <w:szCs w:val="18"/>
               </w:rPr>
-              <w:t xml:space="preserve">Communardo blog post (April 25, 2024) announcing the integration of German IT service provider Scolution into the Communardo Group, strengthening its Atlassian market position and regional presence in Swabian Hall.</w:t>
+              <w:t xml:space="preserve">BU Bregal Unternehmerkapital's coverage of Communardo Group's acquisition of Norwegian Atlassian Platinum Partner Computas Opus, establishing market leadership across all four Nordic countries.</w:t>
             </w:r>
           </w:p>
         </w:tc>
@@ -9328,7 +9328,7 @@
                 <w:sz w:val="18"/>
                 <w:szCs w:val="18"/>
               </w:rPr>
-              <w:t xml:space="preserve">2026-07-18</w:t>
+              <w:t xml:space="preserve">2026-07-19</w:t>
             </w:r>
           </w:p>
         </w:tc>
@@ -9380,7 +9380,7 @@
                 <w:sz w:val="18"/>
                 <w:szCs w:val="18"/>
               </w:rPr>
-              <w:t xml:space="preserve">Communardo Group welcomes Stretch Addera as a new partner</w:t>
+              <w:t xml:space="preserve">Elevatic enters into a put option agreement to acquire Elements</w:t>
             </w:r>
           </w:p>
         </w:tc>
@@ -9406,7 +9406,7 @@
                 <w:sz w:val="18"/>
                 <w:szCs w:val="18"/>
               </w:rPr>
-              <w:t xml:space="preserve">BU Partners' coverage of Communardo Group welcoming Swedish Atlassian Platinum Partner Stretch Addera, marking its Nordic market entry.</w:t>
+              <w:t xml:space="preserve">M&amp;A advisory firm Clipperton's announcement of Elevatic's put option agreement to acquire Atlassian Marketplace vendor Elements, adding Service Management capabilities to Elevatic's portfolio.</w:t>
             </w:r>
           </w:p>
         </w:tc>
@@ -9434,7 +9434,7 @@
                 <w:sz w:val="18"/>
                 <w:szCs w:val="18"/>
               </w:rPr>
-              <w:t xml:space="preserve">2026-07-18</w:t>
+              <w:t xml:space="preserve">2026-07-19</w:t>
             </w:r>
           </w:p>
         </w:tc>
@@ -9486,7 +9486,7 @@
                 <w:sz w:val="18"/>
                 <w:szCs w:val="18"/>
               </w:rPr>
-              <w:t xml:space="preserve">Communardo Has Agreed to be Acquired by Bregal Unternehmerkapital</w:t>
+              <w:t xml:space="preserve">Elevatic, Communardo Group's software business, to acquire Atlassian marketplace vendor Elements</w:t>
             </w:r>
           </w:p>
         </w:tc>
@@ -9512,7 +9512,7 @@
                 <w:sz w:val="18"/>
                 <w:szCs w:val="18"/>
               </w:rPr>
-              <w:t xml:space="preserve">William Blair announced (Sept 4, 2024) it acted as exclusive financial advisor to Communardo, then a PROM12 portfolio company, on its agreed sale to Bregal Unternehmerkapital.</w:t>
+              <w:t xml:space="preserve">Elevatic Software GmbH, the Communardo Group's software business, agreed to acquire France-based Atlassian Marketplace vendor Elements APPS SAS, adding Service Management as a third solution area to its portfolio.</w:t>
             </w:r>
           </w:p>
         </w:tc>

</xml_diff>

<commit_message>
Objective detail click-through view: My Impact tab + Cowork dashboard — full breakdown, auto-updating summary, linked evidence/activity detail, action points; evidence files viewable in dashboard only
</commit_message>
<xml_diff>
--- a/reports/Orbit2_Report_Atlassian_2026-Q3.docx
+++ b/reports/Orbit2_Report_Atlassian_2026-Q3.docx
@@ -8314,7 +8314,7 @@
           <w:sz w:val="20"/>
           <w:szCs w:val="20"/>
         </w:rPr>
-        <w:t xml:space="preserve">Logged mentions: 38 total — 37 positive, 1 neutral, 0 negative.</w:t>
+        <w:t xml:space="preserve">Logged mentions: 43 total — 42 positive, 1 neutral, 0 negative.</w:t>
       </w:r>
     </w:p>
     <w:tbl>
@@ -8480,7 +8480,7 @@
                 <w:sz w:val="18"/>
                 <w:szCs w:val="18"/>
               </w:rPr>
-              <w:t xml:space="preserve">2026-07-20</w:t>
+              <w:t xml:space="preserve">2026-07-21</w:t>
             </w:r>
           </w:p>
         </w:tc>
@@ -8506,7 +8506,7 @@
                 <w:sz w:val="18"/>
                 <w:szCs w:val="18"/>
               </w:rPr>
-              <w:t xml:space="preserve">neutral</w:t>
+              <w:t xml:space="preserve">positive</w:t>
             </w:r>
           </w:p>
         </w:tc>
@@ -8532,7 +8532,7 @@
                 <w:sz w:val="18"/>
                 <w:szCs w:val="18"/>
               </w:rPr>
-              <w:t xml:space="preserve">Elevatic - Atlassian Marketplace vendor listing</w:t>
+              <w:t xml:space="preserve">Communardo weitet Europa-Präsenz aus</w:t>
             </w:r>
           </w:p>
         </w:tc>
@@ -8558,7 +8558,7 @@
                 <w:sz w:val="18"/>
                 <w:szCs w:val="18"/>
               </w:rPr>
-              <w:t xml:space="preserve">Atlassian Marketplace vendor profile for Elevatic (formerly Communardo Products, bitvoodoo, and Mibex), listing Platinum Marketplace and Solution Partner status and its portfolio of 16+ Confluence/Jira/Bitbucket apps.</w:t>
+              <w:t xml:space="preserve">ChannelPartner (Jan 12, 2026) reports Communardo expanded into the Netherlands (Prepend) and Finland (Ambientia) in late 2025/early 2026, putting it in nine European countries as it pursues becoming Europe's largest Atlassian partner.</w:t>
             </w:r>
           </w:p>
         </w:tc>
@@ -8586,7 +8586,7 @@
                 <w:sz w:val="18"/>
                 <w:szCs w:val="18"/>
               </w:rPr>
-              <w:t xml:space="preserve">2026-07-20</w:t>
+              <w:t xml:space="preserve">2026-07-21</w:t>
             </w:r>
           </w:p>
         </w:tc>
@@ -8638,7 +8638,7 @@
                 <w:sz w:val="18"/>
                 <w:szCs w:val="18"/>
               </w:rPr>
-              <w:t xml:space="preserve">Communardo Switzerland - Atlassian Solutions Partner Directory listing</w:t>
+              <w:t xml:space="preserve">celix wird zu Communardo Austria (brand transition FAQ)</w:t>
             </w:r>
           </w:p>
         </w:tc>
@@ -8664,7 +8664,7 @@
                 <w:sz w:val="18"/>
                 <w:szCs w:val="18"/>
               </w:rPr>
-              <w:t xml:space="preserve">Atlassian's official partner directory profile for Communardo Switzerland (formerly bitvoodoo) shows Platinum Solution Partner status, 46 sales and 24 delivery accreditations, and a 2023 Marketing Innovator award.</w:t>
+              <w:t xml:space="preserve">celix Solutions' customer FAQ page announcing its rebrand to Communardo Austria GmbH as part of deeper integration into the Communardo Group, with contracts and contacts unchanged.</w:t>
             </w:r>
           </w:p>
         </w:tc>
@@ -8692,7 +8692,7 @@
                 <w:sz w:val="18"/>
                 <w:szCs w:val="18"/>
               </w:rPr>
-              <w:t xml:space="preserve">2026-07-20</w:t>
+              <w:t xml:space="preserve">2026-07-21</w:t>
             </w:r>
           </w:p>
         </w:tc>
@@ -8744,7 +8744,7 @@
                 <w:sz w:val="18"/>
                 <w:szCs w:val="18"/>
               </w:rPr>
-              <w:t xml:space="preserve">BU-backed Communardo adds on Stretch Addera</w:t>
+              <w:t xml:space="preserve">Communardo welcomes celix as a new partner</w:t>
             </w:r>
           </w:p>
         </w:tc>
@@ -8770,7 +8770,7 @@
                 <w:sz w:val="18"/>
                 <w:szCs w:val="18"/>
               </w:rPr>
-              <w:t xml:space="preserve">PE Hub's private-equity trade coverage of BU-backed Communardo Group's add-on acquisition of Swedish Atlassian partner Stretch Addera.</w:t>
+              <w:t xml:space="preserve">BU Bregal Unternehmerkapital's own coverage of Communardo Group welcoming Austrian Atlassian specialist celix, strengthening its market position in Austria.</w:t>
             </w:r>
           </w:p>
         </w:tc>
@@ -8798,7 +8798,7 @@
                 <w:sz w:val="18"/>
                 <w:szCs w:val="18"/>
               </w:rPr>
-              <w:t xml:space="preserve">2026-07-20</w:t>
+              <w:t xml:space="preserve">2026-07-21</w:t>
             </w:r>
           </w:p>
         </w:tc>
@@ -8850,7 +8850,7 @@
                 <w:sz w:val="18"/>
                 <w:szCs w:val="18"/>
               </w:rPr>
-              <w:t xml:space="preserve">Communardo Acquires Stretch Addera from Stretch AB</w:t>
+              <w:t xml:space="preserve">Paul Hastings advises Bregal on acquisition of Celix by Communardo</w:t>
             </w:r>
           </w:p>
         </w:tc>
@@ -8876,7 +8876,7 @@
                 <w:sz w:val="18"/>
                 <w:szCs w:val="18"/>
               </w:rPr>
-              <w:t xml:space="preserve">Global Legal Chronicle's coverage of Communardo Group's acquisition of Stretch Addera AB, a leading Atlassian Platinum Solution Partner in Sweden, and the legal advisors involved.</w:t>
+              <w:t xml:space="preserve">Law firm Paul Hastings announced it advised Bregal Unternehmerkapital on Communardo's acquisition of Austrian Atlassian partner Celix Solutions.</w:t>
             </w:r>
           </w:p>
         </w:tc>
@@ -8904,7 +8904,7 @@
                 <w:sz w:val="18"/>
                 <w:szCs w:val="18"/>
               </w:rPr>
-              <w:t xml:space="preserve">2026-07-20</w:t>
+              <w:t xml:space="preserve">2026-07-21</w:t>
             </w:r>
           </w:p>
         </w:tc>
@@ -8956,7 +8956,7 @@
                 <w:sz w:val="18"/>
                 <w:szCs w:val="18"/>
               </w:rPr>
-              <w:t xml:space="preserve">Paul Hastings advises BU Bregal Unternehmerkapital on acquisition of Stretch Addera by Communardo</w:t>
+              <w:t xml:space="preserve">BU-backed Communardo buys Celix Solutions in Austria</w:t>
             </w:r>
           </w:p>
         </w:tc>
@@ -8982,7 +8982,7 @@
                 <w:sz w:val="18"/>
                 <w:szCs w:val="18"/>
               </w:rPr>
-              <w:t xml:space="preserve">Law firm Paul Hastings announced it advised BU Bregal Unternehmerkapital on Communardo's acquisition of Swedish Atlassian Platinum Solution Partner Stretch Addera, marking Communardo's entry into the Nordic market.</w:t>
+              <w:t xml:space="preserve">PE Hub's trade coverage of BU-backed Communardo Group's acquisition of Austrian Atlassian consultancy Celix Solutions, strengthening its DACH-region market position.</w:t>
             </w:r>
           </w:p>
         </w:tc>
@@ -9036,7 +9036,7 @@
                 <w:sz w:val="18"/>
                 <w:szCs w:val="18"/>
               </w:rPr>
-              <w:t xml:space="preserve">positive</w:t>
+              <w:t xml:space="preserve">neutral</w:t>
             </w:r>
           </w:p>
         </w:tc>
@@ -9062,7 +9062,7 @@
                 <w:sz w:val="18"/>
                 <w:szCs w:val="18"/>
               </w:rPr>
-              <w:t xml:space="preserve">Communardo and Mibex Software join forces</w:t>
+              <w:t xml:space="preserve">Elevatic - Atlassian Marketplace vendor listing</w:t>
             </w:r>
           </w:p>
         </w:tc>
@@ -9088,7 +9088,7 @@
                 <w:sz w:val="18"/>
                 <w:szCs w:val="18"/>
               </w:rPr>
-              <w:t xml:space="preserve">Communardo Group's own press release (Dec 17, 2024) announcing its acquisition of Swiss Atlassian Gold Marketplace Partner Mibex Software, strengthening its DevOps app portfolio serving 2,700+ customers.</w:t>
+              <w:t xml:space="preserve">Atlassian Marketplace vendor profile for Elevatic (formerly Communardo Products, bitvoodoo, and Mibex), listing Platinum Marketplace and Solution Partner status and its portfolio of 16+ Confluence/Jira/Bitbucket apps.</w:t>
             </w:r>
           </w:p>
         </w:tc>
@@ -9168,7 +9168,7 @@
                 <w:sz w:val="18"/>
                 <w:szCs w:val="18"/>
               </w:rPr>
-              <w:t xml:space="preserve">SWNetwork joins the Communardo Group and strengthens DevOps capabilities</w:t>
+              <w:t xml:space="preserve">Communardo Switzerland - Atlassian Solutions Partner Directory listing</w:t>
             </w:r>
           </w:p>
         </w:tc>
@@ -9194,7 +9194,7 @@
                 <w:sz w:val="18"/>
                 <w:szCs w:val="18"/>
               </w:rPr>
-              <w:t xml:space="preserve">Communardo Group acquired Atlassian DevOps specialist SWNetwork (founded 2016), strengthening its DevOps consulting and solution development capabilities; all SWNetwork employees join Communardo's existing DevOps team.</w:t>
+              <w:t xml:space="preserve">Atlassian's official partner directory profile for Communardo Switzerland (formerly bitvoodoo) shows Platinum Solution Partner status, 46 sales and 24 delivery accreditations, and a 2023 Marketing Innovator award.</w:t>
             </w:r>
           </w:p>
         </w:tc>
@@ -9222,7 +9222,7 @@
                 <w:sz w:val="18"/>
                 <w:szCs w:val="18"/>
               </w:rPr>
-              <w:t xml:space="preserve">2026-07-19</w:t>
+              <w:t xml:space="preserve">2026-07-20</w:t>
             </w:r>
           </w:p>
         </w:tc>
@@ -9274,7 +9274,7 @@
                 <w:sz w:val="18"/>
                 <w:szCs w:val="18"/>
               </w:rPr>
-              <w:t xml:space="preserve">Communardo strengthens its presence in Norway through the acquisition of Computas Opus</w:t>
+              <w:t xml:space="preserve">BU-backed Communardo adds on Stretch Addera</w:t>
             </w:r>
           </w:p>
         </w:tc>
@@ -9300,7 +9300,7 @@
                 <w:sz w:val="18"/>
                 <w:szCs w:val="18"/>
               </w:rPr>
-              <w:t xml:space="preserve">BU Bregal Unternehmerkapital's coverage of Communardo Group's acquisition of Norwegian Atlassian Platinum Partner Computas Opus, establishing market leadership across all four Nordic countries.</w:t>
+              <w:t xml:space="preserve">PE Hub's private-equity trade coverage of BU-backed Communardo Group's add-on acquisition of Swedish Atlassian partner Stretch Addera.</w:t>
             </w:r>
           </w:p>
         </w:tc>
@@ -9328,7 +9328,7 @@
                 <w:sz w:val="18"/>
                 <w:szCs w:val="18"/>
               </w:rPr>
-              <w:t xml:space="preserve">2026-07-19</w:t>
+              <w:t xml:space="preserve">2026-07-20</w:t>
             </w:r>
           </w:p>
         </w:tc>
@@ -9380,7 +9380,7 @@
                 <w:sz w:val="18"/>
                 <w:szCs w:val="18"/>
               </w:rPr>
-              <w:t xml:space="preserve">Elevatic enters into a put option agreement to acquire Elements</w:t>
+              <w:t xml:space="preserve">Communardo Acquires Stretch Addera from Stretch AB</w:t>
             </w:r>
           </w:p>
         </w:tc>
@@ -9406,7 +9406,7 @@
                 <w:sz w:val="18"/>
                 <w:szCs w:val="18"/>
               </w:rPr>
-              <w:t xml:space="preserve">M&amp;A advisory firm Clipperton's announcement of Elevatic's put option agreement to acquire Atlassian Marketplace vendor Elements, adding Service Management capabilities to Elevatic's portfolio.</w:t>
+              <w:t xml:space="preserve">Global Legal Chronicle's coverage of Communardo Group's acquisition of Stretch Addera AB, a leading Atlassian Platinum Solution Partner in Sweden, and the legal advisors involved.</w:t>
             </w:r>
           </w:p>
         </w:tc>
@@ -9434,7 +9434,7 @@
                 <w:sz w:val="18"/>
                 <w:szCs w:val="18"/>
               </w:rPr>
-              <w:t xml:space="preserve">2026-07-19</w:t>
+              <w:t xml:space="preserve">2026-07-20</w:t>
             </w:r>
           </w:p>
         </w:tc>
@@ -9486,7 +9486,7 @@
                 <w:sz w:val="18"/>
                 <w:szCs w:val="18"/>
               </w:rPr>
-              <w:t xml:space="preserve">Elevatic, Communardo Group's software business, to acquire Atlassian marketplace vendor Elements</w:t>
+              <w:t xml:space="preserve">Paul Hastings advises BU Bregal Unternehmerkapital on acquisition of Stretch Addera by Communardo</w:t>
             </w:r>
           </w:p>
         </w:tc>
@@ -9512,7 +9512,7 @@
                 <w:sz w:val="18"/>
                 <w:szCs w:val="18"/>
               </w:rPr>
-              <w:t xml:space="preserve">Elevatic Software GmbH, the Communardo Group's software business, agreed to acquire France-based Atlassian Marketplace vendor Elements APPS SAS, adding Service Management as a third solution area to its portfolio.</w:t>
+              <w:t xml:space="preserve">Law firm Paul Hastings announced it advised BU Bregal Unternehmerkapital on Communardo's acquisition of Swedish Atlassian Platinum Solution Partner Stretch Addera, marking Communardo's entry into the Nordic market.</w:t>
             </w:r>
           </w:p>
         </w:tc>

</xml_diff>

<commit_message>
IR-A1/A2/C1: fix public visibility leak for Objectives/Actions (shared visibility.py); IR-B1: has_data missing-vs-zero display signal in scoring
</commit_message>
<xml_diff>
--- a/reports/Orbit2_Report_Atlassian_2026-Q3.docx
+++ b/reports/Orbit2_Report_Atlassian_2026-Q3.docx
@@ -20,7 +20,7 @@
           <w:sz w:val="18"/>
           <w:szCs w:val="18"/>
         </w:rPr>
-        <w:t xml:space="preserve">Generated 2026-07-21 · Prepared for Steve Mojsak, Atlassian Alliance Manager, Communardo</w:t>
+        <w:t xml:space="preserve">Generated 2026-07-22 · Prepared for Steve Mojsak, Atlassian Alliance Manager, Communardo</w:t>
       </w:r>
     </w:p>
     <w:p>
@@ -8314,7 +8314,7 @@
           <w:sz w:val="20"/>
           <w:szCs w:val="20"/>
         </w:rPr>
-        <w:t xml:space="preserve">Logged mentions: 43 total — 42 positive, 1 neutral, 0 negative.</w:t>
+        <w:t xml:space="preserve">Logged mentions: 52 total — 50 positive, 2 neutral, 0 negative.</w:t>
       </w:r>
     </w:p>
     <w:tbl>
@@ -8480,7 +8480,7 @@
                 <w:sz w:val="18"/>
                 <w:szCs w:val="18"/>
               </w:rPr>
-              <w:t xml:space="preserve">2026-07-21</w:t>
+              <w:t xml:space="preserve">2026-07-22</w:t>
             </w:r>
           </w:p>
         </w:tc>
@@ -8532,7 +8532,7 @@
                 <w:sz w:val="18"/>
                 <w:szCs w:val="18"/>
               </w:rPr>
-              <w:t xml:space="preserve">Communardo weitet Europa-Präsenz aus</w:t>
+              <w:t xml:space="preserve">Communardo Sweden AB - Atlassian Solutions Partner Directory listing</w:t>
             </w:r>
           </w:p>
         </w:tc>
@@ -8558,7 +8558,7 @@
                 <w:sz w:val="18"/>
                 <w:szCs w:val="18"/>
               </w:rPr>
-              <w:t xml:space="preserve">ChannelPartner (Jan 12, 2026) reports Communardo expanded into the Netherlands (Prepend) and Finland (Ambientia) in late 2025/early 2026, putting it in nine European countries as it pursues becoming Europe's largest Atlassian partner.</w:t>
+              <w:t xml:space="preserve">Atlassian's official partner directory profile for Communardo Sweden AB (formerly Stretch Addera) shows Platinum Solution Partner status, 86 delivery/107 sales accreditations, and a 2018 Atlassian Partner of the Year: Cloud award.</w:t>
             </w:r>
           </w:p>
         </w:tc>
@@ -8586,7 +8586,7 @@
                 <w:sz w:val="18"/>
                 <w:szCs w:val="18"/>
               </w:rPr>
-              <w:t xml:space="preserve">2026-07-21</w:t>
+              <w:t xml:space="preserve">2026-07-22</w:t>
             </w:r>
           </w:p>
         </w:tc>
@@ -8638,7 +8638,7 @@
                 <w:sz w:val="18"/>
                 <w:szCs w:val="18"/>
               </w:rPr>
-              <w:t xml:space="preserve">celix wird zu Communardo Austria (brand transition FAQ)</w:t>
+              <w:t xml:space="preserve">aety Acquired by Communardo</w:t>
             </w:r>
           </w:p>
         </w:tc>
@@ -8664,7 +8664,7 @@
                 <w:sz w:val="18"/>
                 <w:szCs w:val="18"/>
               </w:rPr>
-              <w:t xml:space="preserve">celix Solutions' customer FAQ page announcing its rebrand to Communardo Austria GmbH as part of deeper integration into the Communardo Group, with contracts and contacts unchanged.</w:t>
+              <w:t xml:space="preserve">Signalbase M&amp;A news tracker coverage of Communardo's acquisition of Danish Atlassian consultancy Aety, extending its Nordic market leadership.</w:t>
             </w:r>
           </w:p>
         </w:tc>
@@ -8692,7 +8692,7 @@
                 <w:sz w:val="18"/>
                 <w:szCs w:val="18"/>
               </w:rPr>
-              <w:t xml:space="preserve">2026-07-21</w:t>
+              <w:t xml:space="preserve">2026-07-22</w:t>
             </w:r>
           </w:p>
         </w:tc>
@@ -8744,7 +8744,7 @@
                 <w:sz w:val="18"/>
                 <w:szCs w:val="18"/>
               </w:rPr>
-              <w:t xml:space="preserve">Communardo welcomes celix as a new partner</w:t>
+              <w:t xml:space="preserve">BU-backed software company Communardo acquires Austrian IT firm ByteSource</w:t>
             </w:r>
           </w:p>
         </w:tc>
@@ -8770,7 +8770,7 @@
                 <w:sz w:val="18"/>
                 <w:szCs w:val="18"/>
               </w:rPr>
-              <w:t xml:space="preserve">BU Bregal Unternehmerkapital's own coverage of Communardo Group welcoming Austrian Atlassian specialist celix, strengthening its market position in Austria.</w:t>
+              <w:t xml:space="preserve">M&amp;A intelligence tracker Mainsights' coverage of BU-backed Communardo's acquisition of Austrian Atlassian Platinum Partner ByteSource, strengthening its DACH and cloud/DevOps capabilities.</w:t>
             </w:r>
           </w:p>
         </w:tc>
@@ -8798,7 +8798,7 @@
                 <w:sz w:val="18"/>
                 <w:szCs w:val="18"/>
               </w:rPr>
-              <w:t xml:space="preserve">2026-07-21</w:t>
+              <w:t xml:space="preserve">2026-07-22</w:t>
             </w:r>
           </w:p>
         </w:tc>
@@ -8850,7 +8850,7 @@
                 <w:sz w:val="18"/>
                 <w:szCs w:val="18"/>
               </w:rPr>
-              <w:t xml:space="preserve">Paul Hastings advises Bregal on acquisition of Celix by Communardo</w:t>
+              <w:t xml:space="preserve">Communardo gewinnt Bregal Unternehmerkapital als Partner (PROM12 announcement)</w:t>
             </w:r>
           </w:p>
         </w:tc>
@@ -8876,7 +8876,7 @@
                 <w:sz w:val="18"/>
                 <w:szCs w:val="18"/>
               </w:rPr>
-              <w:t xml:space="preserve">Law firm Paul Hastings announced it advised Bregal Unternehmerkapital on Communardo's acquisition of Austrian Atlassian partner Celix Solutions.</w:t>
+              <w:t xml:space="preserve">PROM12's own press release (German) announcing Communardo winning Bregal Unternehmerkapital as a partner to drive its customer-centric growth strategy and European expansion.</w:t>
             </w:r>
           </w:p>
         </w:tc>
@@ -8904,7 +8904,7 @@
                 <w:sz w:val="18"/>
                 <w:szCs w:val="18"/>
               </w:rPr>
-              <w:t xml:space="preserve">2026-07-21</w:t>
+              <w:t xml:space="preserve">2026-07-22</w:t>
             </w:r>
           </w:p>
         </w:tc>
@@ -8956,7 +8956,7 @@
                 <w:sz w:val="18"/>
                 <w:szCs w:val="18"/>
               </w:rPr>
-              <w:t xml:space="preserve">BU-backed Communardo buys Celix Solutions in Austria</w:t>
+              <w:t xml:space="preserve">GOF advises PROM12 on the sale of Communardo to Bregal Unternehmerkapital</w:t>
             </w:r>
           </w:p>
         </w:tc>
@@ -8982,7 +8982,7 @@
                 <w:sz w:val="18"/>
                 <w:szCs w:val="18"/>
               </w:rPr>
-              <w:t xml:space="preserve">PE Hub's trade coverage of BU-backed Communardo Group's acquisition of Austrian Atlassian consultancy Celix Solutions, strengthening its DACH-region market position.</w:t>
+              <w:t xml:space="preserve">Law firm GOF announced it advised PROM12 on the sale of a majority stake in Communardo to Bregal Unternehmerkapital.</w:t>
             </w:r>
           </w:p>
         </w:tc>
@@ -9010,7 +9010,7 @@
                 <w:sz w:val="18"/>
                 <w:szCs w:val="18"/>
               </w:rPr>
-              <w:t xml:space="preserve">2026-07-20</w:t>
+              <w:t xml:space="preserve">2026-07-22</w:t>
             </w:r>
           </w:p>
         </w:tc>
@@ -9062,7 +9062,7 @@
                 <w:sz w:val="18"/>
                 <w:szCs w:val="18"/>
               </w:rPr>
-              <w:t xml:space="preserve">Elevatic - Atlassian Marketplace vendor listing</w:t>
+              <w:t xml:space="preserve">Case Study: Bregal Unternehmerkapital x Communardo</w:t>
             </w:r>
           </w:p>
         </w:tc>
@@ -9088,7 +9088,7 @@
                 <w:sz w:val="18"/>
                 <w:szCs w:val="18"/>
               </w:rPr>
-              <w:t xml:space="preserve">Atlassian Marketplace vendor profile for Elevatic (formerly Communardo Products, bitvoodoo, and Mibex), listing Platinum Marketplace and Solution Partner status and its portfolio of 16+ Confluence/Jira/Bitbucket apps.</w:t>
+              <w:t xml:space="preserve">Code and Co. case study describing its tech/product due-diligence engagement for Bregal Unternehmerkapital on the Communardo transaction.</w:t>
             </w:r>
           </w:p>
         </w:tc>
@@ -9116,7 +9116,7 @@
                 <w:sz w:val="18"/>
                 <w:szCs w:val="18"/>
               </w:rPr>
-              <w:t xml:space="preserve">2026-07-20</w:t>
+              <w:t xml:space="preserve">2026-07-22</w:t>
             </w:r>
           </w:p>
         </w:tc>
@@ -9168,7 +9168,7 @@
                 <w:sz w:val="18"/>
                 <w:szCs w:val="18"/>
               </w:rPr>
-              <w:t xml:space="preserve">Communardo Switzerland - Atlassian Solutions Partner Directory listing</w:t>
+              <w:t xml:space="preserve">Communardo gewinnt Bregal Unternehmerkapital als Partner</w:t>
             </w:r>
           </w:p>
         </w:tc>
@@ -9194,7 +9194,7 @@
                 <w:sz w:val="18"/>
                 <w:szCs w:val="18"/>
               </w:rPr>
-              <w:t xml:space="preserve">Atlassian's official partner directory profile for Communardo Switzerland (formerly bitvoodoo) shows Platinum Solution Partner status, 46 sales and 24 delivery accreditations, and a 2023 Marketing Innovator award.</w:t>
+              <w:t xml:space="preserve">Bregal's own announcement (German) of its partnership with Communardo Holding GmbH to drive its customer-centric growth strategy and European expansion.</w:t>
             </w:r>
           </w:p>
         </w:tc>
@@ -9222,7 +9222,7 @@
                 <w:sz w:val="18"/>
                 <w:szCs w:val="18"/>
               </w:rPr>
-              <w:t xml:space="preserve">2026-07-20</w:t>
+              <w:t xml:space="preserve">2026-07-22</w:t>
             </w:r>
           </w:p>
         </w:tc>
@@ -9274,7 +9274,7 @@
                 <w:sz w:val="18"/>
                 <w:szCs w:val="18"/>
               </w:rPr>
-              <w:t xml:space="preserve">BU-backed Communardo adds on Stretch Addera</w:t>
+              <w:t xml:space="preserve">15 Monate Partnerschaft mit Bregal Unternehmerkapital</w:t>
             </w:r>
           </w:p>
         </w:tc>
@@ -9300,7 +9300,7 @@
                 <w:sz w:val="18"/>
                 <w:szCs w:val="18"/>
               </w:rPr>
-              <w:t xml:space="preserve">PE Hub's private-equity trade coverage of BU-backed Communardo Group's add-on acquisition of Swedish Atlassian partner Stretch Addera.</w:t>
+              <w:t xml:space="preserve">Silicon Saxony member profile (Feb 4, 2026) reporting Communardo's positive 15-month interim assessment of its BU Bregal Unternehmerkapital partnership: 460+ employees, 21 locations, seven acquisitions, and quotes from Atlassian's Head of International Partners and Alliances praising Communardo's growth.</w:t>
             </w:r>
           </w:p>
         </w:tc>
@@ -9328,7 +9328,7 @@
                 <w:sz w:val="18"/>
                 <w:szCs w:val="18"/>
               </w:rPr>
-              <w:t xml:space="preserve">2026-07-20</w:t>
+              <w:t xml:space="preserve">2026-07-22</w:t>
             </w:r>
           </w:p>
         </w:tc>
@@ -9380,7 +9380,7 @@
                 <w:sz w:val="18"/>
                 <w:szCs w:val="18"/>
               </w:rPr>
-              <w:t xml:space="preserve">Communardo Acquires Stretch Addera from Stretch AB</w:t>
+              <w:t xml:space="preserve">Communardo acquires Ambientia's Atlassian business in Finland (Chambers legal highlight)</w:t>
             </w:r>
           </w:p>
         </w:tc>
@@ -9406,7 +9406,7 @@
                 <w:sz w:val="18"/>
                 <w:szCs w:val="18"/>
               </w:rPr>
-              <w:t xml:space="preserve">Global Legal Chronicle's coverage of Communardo Group's acquisition of Stretch Addera AB, a leading Atlassian Platinum Solution Partner in Sweden, and the legal advisors involved.</w:t>
+              <w:t xml:space="preserve">Chambers and Partners legal highlight (Jan 20, 2026) on Avance advising Communardo Group in its acquisition of Ambientia Group's Atlassian business in Finland, backed by BU Bregal Unternehmerkapital.</w:t>
             </w:r>
           </w:p>
         </w:tc>
@@ -9434,7 +9434,7 @@
                 <w:sz w:val="18"/>
                 <w:szCs w:val="18"/>
               </w:rPr>
-              <w:t xml:space="preserve">2026-07-20</w:t>
+              <w:t xml:space="preserve">2026-07-21</w:t>
             </w:r>
           </w:p>
         </w:tc>
@@ -9486,7 +9486,7 @@
                 <w:sz w:val="18"/>
                 <w:szCs w:val="18"/>
               </w:rPr>
-              <w:t xml:space="preserve">Paul Hastings advises BU Bregal Unternehmerkapital on acquisition of Stretch Addera by Communardo</w:t>
+              <w:t xml:space="preserve">Communardo weitet Europa-Präsenz aus</w:t>
             </w:r>
           </w:p>
         </w:tc>
@@ -9512,7 +9512,7 @@
                 <w:sz w:val="18"/>
                 <w:szCs w:val="18"/>
               </w:rPr>
-              <w:t xml:space="preserve">Law firm Paul Hastings announced it advised BU Bregal Unternehmerkapital on Communardo's acquisition of Swedish Atlassian Platinum Solution Partner Stretch Addera, marking Communardo's entry into the Nordic market.</w:t>
+              <w:t xml:space="preserve">ChannelPartner (Jan 12, 2026) reports Communardo expanded into the Netherlands (Prepend) and Finland (Ambientia) in late 2025/early 2026, putting it in nine European countries as it pursues becoming Europe's largest Atlassian partner.</w:t>
             </w:r>
           </w:p>
         </w:tc>

</xml_diff>